<commit_message>
Auto Daily 8:00 PM Dashboard Update [2026-08-04 20:00]
</commit_message>
<xml_diff>
--- a/docs/weekly/2026-W32_當週執行率回顧報告.docx
+++ b/docs/weekly/2026-W32_當週執行率回顧報告.docx
@@ -21,7 +21,7 @@
           <w:color w:val="555555"/>
           <w:sz w:val="20"/>
         </w:rPr>
-        <w:t>週期：2026/08/03–2026/08/09　｜　整體時間執行率：0.0%</w:t>
+        <w:t>週期：2026/08/03–2026/08/09　｜　整體時間執行率：10.6%</w:t>
       </w:r>
     </w:p>
     <w:p>
@@ -565,7 +565,7 @@
                 <w:color w:val="000000"/>
                 <w:sz w:val="19"/>
               </w:rPr>
-              <w:t>0.00 hr</w:t>
+              <w:t>0.50 hr</w:t>
             </w:r>
           </w:p>
         </w:tc>
@@ -592,7 +592,7 @@
                 <w:color w:val="000000"/>
                 <w:sz w:val="19"/>
               </w:rPr>
-              <w:t>0.0%</w:t>
+              <w:t>8.3%</w:t>
             </w:r>
           </w:p>
         </w:tc>
@@ -646,7 +646,7 @@
                 <w:color w:val="000000"/>
                 <w:sz w:val="19"/>
               </w:rPr>
-              <w:t>0.00 km</w:t>
+              <w:t>7.45 km</w:t>
             </w:r>
           </w:p>
         </w:tc>
@@ -700,7 +700,7 @@
                 <w:color w:val="000000"/>
                 <w:sz w:val="19"/>
               </w:rPr>
-              <w:t>2</w:t>
+              <w:t>3</w:t>
             </w:r>
           </w:p>
         </w:tc>
@@ -756,7 +756,7 @@
                 <w:color w:val="000000"/>
                 <w:sz w:val="19"/>
               </w:rPr>
-              <w:t>6.25 hr</w:t>
+              <w:t>7.75 hr</w:t>
             </w:r>
           </w:p>
         </w:tc>
@@ -783,7 +783,7 @@
                 <w:color w:val="000000"/>
                 <w:sz w:val="19"/>
               </w:rPr>
-              <w:t>0.00 hr</w:t>
+              <w:t>1.40 hr</w:t>
             </w:r>
           </w:p>
         </w:tc>
@@ -810,7 +810,7 @@
                 <w:color w:val="000000"/>
                 <w:sz w:val="19"/>
               </w:rPr>
-              <w:t>0.0%</w:t>
+              <w:t>18.1%</w:t>
             </w:r>
           </w:p>
         </w:tc>
@@ -837,7 +837,7 @@
                 <w:color w:val="000000"/>
                 <w:sz w:val="19"/>
               </w:rPr>
-              <w:t>52.40 km</w:t>
+              <w:t>63.60 km</w:t>
             </w:r>
           </w:p>
         </w:tc>
@@ -864,7 +864,7 @@
                 <w:color w:val="000000"/>
                 <w:sz w:val="19"/>
               </w:rPr>
-              <w:t>0.00 km</w:t>
+              <w:t>11.58 km</w:t>
             </w:r>
           </w:p>
         </w:tc>
@@ -891,7 +891,7 @@
                 <w:color w:val="000000"/>
                 <w:sz w:val="19"/>
               </w:rPr>
-              <w:t>0.0%</w:t>
+              <w:t>18.2%</w:t>
             </w:r>
           </w:p>
         </w:tc>
@@ -918,7 +918,7 @@
                 <w:color w:val="000000"/>
                 <w:sz w:val="19"/>
               </w:rPr>
-              <w:t>4</w:t>
+              <w:t>5</w:t>
             </w:r>
           </w:p>
         </w:tc>
@@ -1825,6 +1825,338 @@
                 <w:sz w:val="19"/>
               </w:rPr>
               <w:t>❌ 未執行</w:t>
+            </w:r>
+          </w:p>
+        </w:tc>
+      </w:tr>
+      <w:tr>
+        <w:tc>
+          <w:tcPr>
+            <w:tcW w:type="dxa" w:w="1100"/>
+            <w:tcMar>
+              <w:top w:w="80" w:type="dxa"/>
+              <w:start w:w="120" w:type="dxa"/>
+              <w:bottom w:w="80" w:type="dxa"/>
+              <w:end w:w="120" w:type="dxa"/>
+            </w:tcMar>
+            <w:vAlign w:val="center"/>
+          </w:tcPr>
+          <w:p>
+            <w:pPr>
+              <w:spacing w:after="0"/>
+              <w:jc w:val="center"/>
+            </w:pPr>
+            <w:r>
+              <w:rPr>
+                <w:rFonts w:ascii="Calibri" w:hAnsi="Calibri" w:eastAsia="Microsoft JhengHei"/>
+                <w:b w:val="0"/>
+                <w:color w:val="000000"/>
+                <w:sz w:val="19"/>
+              </w:rPr>
+              <w:t>08/04</w:t>
+              <w:br/>
+              <w:t>週二</w:t>
+            </w:r>
+          </w:p>
+        </w:tc>
+        <w:tc>
+          <w:tcPr>
+            <w:tcW w:type="dxa" w:w="3100"/>
+            <w:tcMar>
+              <w:top w:w="80" w:type="dxa"/>
+              <w:start w:w="120" w:type="dxa"/>
+              <w:bottom w:w="80" w:type="dxa"/>
+              <w:end w:w="120" w:type="dxa"/>
+            </w:tcMar>
+            <w:vAlign w:val="center"/>
+          </w:tcPr>
+          <w:p>
+            <w:pPr>
+              <w:spacing w:after="0"/>
+              <w:jc w:val="left"/>
+            </w:pPr>
+            <w:r>
+              <w:rPr>
+                <w:rFonts w:ascii="Calibri" w:hAnsi="Calibri" w:eastAsia="Microsoft JhengHei"/>
+                <w:b w:val="0"/>
+                <w:color w:val="000000"/>
+                <w:sz w:val="19"/>
+              </w:rPr>
+              <w:t>Run: Running</w:t>
+            </w:r>
+          </w:p>
+        </w:tc>
+        <w:tc>
+          <w:tcPr>
+            <w:tcW w:type="dxa" w:w="1100"/>
+            <w:tcMar>
+              <w:top w:w="80" w:type="dxa"/>
+              <w:start w:w="120" w:type="dxa"/>
+              <w:bottom w:w="80" w:type="dxa"/>
+              <w:end w:w="120" w:type="dxa"/>
+            </w:tcMar>
+            <w:vAlign w:val="center"/>
+          </w:tcPr>
+          <w:p>
+            <w:pPr>
+              <w:spacing w:after="0"/>
+              <w:jc w:val="center"/>
+            </w:pPr>
+            <w:r>
+              <w:rPr>
+                <w:rFonts w:ascii="Calibri" w:hAnsi="Calibri" w:eastAsia="Microsoft JhengHei"/>
+                <w:b w:val="0"/>
+                <w:color w:val="000000"/>
+                <w:sz w:val="19"/>
+              </w:rPr>
+              <w:t>Run</w:t>
+            </w:r>
+          </w:p>
+        </w:tc>
+        <w:tc>
+          <w:tcPr>
+            <w:tcW w:type="dxa" w:w="1600"/>
+            <w:tcMar>
+              <w:top w:w="80" w:type="dxa"/>
+              <w:start w:w="120" w:type="dxa"/>
+              <w:bottom w:w="80" w:type="dxa"/>
+              <w:end w:w="120" w:type="dxa"/>
+            </w:tcMar>
+            <w:vAlign w:val="center"/>
+          </w:tcPr>
+          <w:p>
+            <w:pPr>
+              <w:spacing w:after="0"/>
+              <w:jc w:val="center"/>
+            </w:pPr>
+            <w:r>
+              <w:rPr>
+                <w:rFonts w:ascii="Calibri" w:hAnsi="Calibri" w:eastAsia="Microsoft JhengHei"/>
+                <w:b w:val="0"/>
+                <w:color w:val="000000"/>
+                <w:sz w:val="19"/>
+              </w:rPr>
+              <w:t>90分 / 11.20km</w:t>
+            </w:r>
+          </w:p>
+        </w:tc>
+        <w:tc>
+          <w:tcPr>
+            <w:tcW w:type="dxa" w:w="1600"/>
+            <w:tcMar>
+              <w:top w:w="80" w:type="dxa"/>
+              <w:start w:w="120" w:type="dxa"/>
+              <w:bottom w:w="80" w:type="dxa"/>
+              <w:end w:w="120" w:type="dxa"/>
+            </w:tcMar>
+            <w:vAlign w:val="center"/>
+          </w:tcPr>
+          <w:p>
+            <w:pPr>
+              <w:spacing w:after="0"/>
+              <w:jc w:val="center"/>
+            </w:pPr>
+            <w:r>
+              <w:rPr>
+                <w:rFonts w:ascii="Calibri" w:hAnsi="Calibri" w:eastAsia="Microsoft JhengHei"/>
+                <w:b w:val="0"/>
+                <w:color w:val="000000"/>
+                <w:sz w:val="19"/>
+              </w:rPr>
+              <w:t>84分 / 11.58km</w:t>
+            </w:r>
+          </w:p>
+        </w:tc>
+        <w:tc>
+          <w:tcPr>
+            <w:tcW w:type="dxa" w:w="1160"/>
+            <w:tcMar>
+              <w:top w:w="80" w:type="dxa"/>
+              <w:start w:w="120" w:type="dxa"/>
+              <w:bottom w:w="80" w:type="dxa"/>
+              <w:end w:w="120" w:type="dxa"/>
+            </w:tcMar>
+            <w:vAlign w:val="center"/>
+          </w:tcPr>
+          <w:p>
+            <w:pPr>
+              <w:spacing w:after="0"/>
+              <w:jc w:val="center"/>
+            </w:pPr>
+            <w:r>
+              <w:rPr>
+                <w:rFonts w:ascii="Calibri" w:hAnsi="Calibri" w:eastAsia="Microsoft JhengHei"/>
+                <w:b w:val="0"/>
+                <w:color w:val="000000"/>
+                <w:sz w:val="19"/>
+              </w:rPr>
+              <w:t>✅ 已完成</w:t>
+            </w:r>
+          </w:p>
+        </w:tc>
+      </w:tr>
+      <w:tr>
+        <w:tc>
+          <w:tcPr>
+            <w:tcW w:type="dxa" w:w="1100"/>
+            <w:tcMar>
+              <w:top w:w="80" w:type="dxa"/>
+              <w:start w:w="120" w:type="dxa"/>
+              <w:bottom w:w="80" w:type="dxa"/>
+              <w:end w:w="120" w:type="dxa"/>
+            </w:tcMar>
+            <w:vAlign w:val="center"/>
+          </w:tcPr>
+          <w:p>
+            <w:pPr>
+              <w:spacing w:after="0"/>
+              <w:jc w:val="center"/>
+            </w:pPr>
+            <w:r>
+              <w:rPr>
+                <w:rFonts w:ascii="Calibri" w:hAnsi="Calibri" w:eastAsia="Microsoft JhengHei"/>
+                <w:b w:val="0"/>
+                <w:color w:val="000000"/>
+                <w:sz w:val="19"/>
+              </w:rPr>
+              <w:t>08/04</w:t>
+              <w:br/>
+              <w:t>週二</w:t>
+            </w:r>
+          </w:p>
+        </w:tc>
+        <w:tc>
+          <w:tcPr>
+            <w:tcW w:type="dxa" w:w="3100"/>
+            <w:tcMar>
+              <w:top w:w="80" w:type="dxa"/>
+              <w:start w:w="120" w:type="dxa"/>
+              <w:bottom w:w="80" w:type="dxa"/>
+              <w:end w:w="120" w:type="dxa"/>
+            </w:tcMar>
+            <w:vAlign w:val="center"/>
+          </w:tcPr>
+          <w:p>
+            <w:pPr>
+              <w:spacing w:after="0"/>
+              <w:jc w:val="left"/>
+            </w:pPr>
+            <w:r>
+              <w:rPr>
+                <w:rFonts w:ascii="Calibri" w:hAnsi="Calibri" w:eastAsia="Microsoft JhengHei"/>
+                <w:b w:val="0"/>
+                <w:color w:val="000000"/>
+                <w:sz w:val="19"/>
+              </w:rPr>
+              <w:t>Bike: Cycling</w:t>
+            </w:r>
+          </w:p>
+        </w:tc>
+        <w:tc>
+          <w:tcPr>
+            <w:tcW w:type="dxa" w:w="1100"/>
+            <w:tcMar>
+              <w:top w:w="80" w:type="dxa"/>
+              <w:start w:w="120" w:type="dxa"/>
+              <w:bottom w:w="80" w:type="dxa"/>
+              <w:end w:w="120" w:type="dxa"/>
+            </w:tcMar>
+            <w:vAlign w:val="center"/>
+          </w:tcPr>
+          <w:p>
+            <w:pPr>
+              <w:spacing w:after="0"/>
+              <w:jc w:val="center"/>
+            </w:pPr>
+            <w:r>
+              <w:rPr>
+                <w:rFonts w:ascii="Calibri" w:hAnsi="Calibri" w:eastAsia="Microsoft JhengHei"/>
+                <w:b w:val="0"/>
+                <w:color w:val="000000"/>
+                <w:sz w:val="19"/>
+              </w:rPr>
+              <w:t>Bike</w:t>
+            </w:r>
+          </w:p>
+        </w:tc>
+        <w:tc>
+          <w:tcPr>
+            <w:tcW w:type="dxa" w:w="1600"/>
+            <w:tcMar>
+              <w:top w:w="80" w:type="dxa"/>
+              <w:start w:w="120" w:type="dxa"/>
+              <w:bottom w:w="80" w:type="dxa"/>
+              <w:end w:w="120" w:type="dxa"/>
+            </w:tcMar>
+            <w:vAlign w:val="center"/>
+          </w:tcPr>
+          <w:p>
+            <w:pPr>
+              <w:spacing w:after="0"/>
+              <w:jc w:val="center"/>
+            </w:pPr>
+            <w:r>
+              <w:rPr>
+                <w:rFonts w:ascii="Calibri" w:hAnsi="Calibri" w:eastAsia="Microsoft JhengHei"/>
+                <w:b w:val="0"/>
+                <w:color w:val="000000"/>
+                <w:sz w:val="19"/>
+              </w:rPr>
+              <w:t>0分</w:t>
+            </w:r>
+          </w:p>
+        </w:tc>
+        <w:tc>
+          <w:tcPr>
+            <w:tcW w:type="dxa" w:w="1600"/>
+            <w:tcMar>
+              <w:top w:w="80" w:type="dxa"/>
+              <w:start w:w="120" w:type="dxa"/>
+              <w:bottom w:w="80" w:type="dxa"/>
+              <w:end w:w="120" w:type="dxa"/>
+            </w:tcMar>
+            <w:vAlign w:val="center"/>
+          </w:tcPr>
+          <w:p>
+            <w:pPr>
+              <w:spacing w:after="0"/>
+              <w:jc w:val="center"/>
+            </w:pPr>
+            <w:r>
+              <w:rPr>
+                <w:rFonts w:ascii="Calibri" w:hAnsi="Calibri" w:eastAsia="Microsoft JhengHei"/>
+                <w:b w:val="0"/>
+                <w:color w:val="000000"/>
+                <w:sz w:val="19"/>
+              </w:rPr>
+              <w:t>30分 / 7.45km</w:t>
+            </w:r>
+          </w:p>
+        </w:tc>
+        <w:tc>
+          <w:tcPr>
+            <w:tcW w:type="dxa" w:w="1160"/>
+            <w:tcMar>
+              <w:top w:w="80" w:type="dxa"/>
+              <w:start w:w="120" w:type="dxa"/>
+              <w:bottom w:w="80" w:type="dxa"/>
+              <w:end w:w="120" w:type="dxa"/>
+            </w:tcMar>
+            <w:vAlign w:val="center"/>
+          </w:tcPr>
+          <w:p>
+            <w:pPr>
+              <w:spacing w:after="0"/>
+              <w:jc w:val="center"/>
+            </w:pPr>
+            <w:r>
+              <w:rPr>
+                <w:rFonts w:ascii="Calibri" w:hAnsi="Calibri" w:eastAsia="Microsoft JhengHei"/>
+                <w:b w:val="0"/>
+                <w:color w:val="000000"/>
+                <w:sz w:val="19"/>
+              </w:rPr>
+              <w:t>✅ 已完成</w:t>
             </w:r>
           </w:p>
         </w:tc>

</xml_diff>

<commit_message>
Auto Daily 8:00 PM Dashboard Update [2026-08-06 03:10]
</commit_message>
<xml_diff>
--- a/docs/weekly/2026-W32_當週執行率回顧報告.docx
+++ b/docs/weekly/2026-W32_當週執行率回顧報告.docx
@@ -21,7 +21,7 @@
           <w:color w:val="555555"/>
           <w:sz w:val="20"/>
         </w:rPr>
-        <w:t>週期：2026/08/03–2026/08/09　｜　整體時間執行率：10.6%</w:t>
+        <w:t>週期：2026/08/03–2026/08/09　｜　整體時間執行率：11.5%</w:t>
       </w:r>
     </w:p>
     <w:p>
@@ -347,7 +347,7 @@
                 <w:color w:val="000000"/>
                 <w:sz w:val="19"/>
               </w:rPr>
-              <w:t>0.00 hr</w:t>
+              <w:t>1.08 hr</w:t>
             </w:r>
           </w:p>
         </w:tc>
@@ -374,7 +374,7 @@
                 <w:color w:val="000000"/>
                 <w:sz w:val="19"/>
               </w:rPr>
-              <w:t>0.0%</w:t>
+              <w:t>26.0%</w:t>
             </w:r>
           </w:p>
         </w:tc>
@@ -428,7 +428,7 @@
                 <w:color w:val="000000"/>
                 <w:sz w:val="19"/>
               </w:rPr>
-              <w:t>0.00 km</w:t>
+              <w:t>3.30 km</w:t>
             </w:r>
           </w:p>
         </w:tc>
@@ -455,7 +455,7 @@
                 <w:color w:val="000000"/>
                 <w:sz w:val="19"/>
               </w:rPr>
-              <w:t>0.0%</w:t>
+              <w:t>78.6%</w:t>
             </w:r>
           </w:p>
         </w:tc>
@@ -538,7 +538,7 @@
                 <w:color w:val="000000"/>
                 <w:sz w:val="19"/>
               </w:rPr>
-              <w:t>6.00 hr</w:t>
+              <w:t>14.00 hr</w:t>
             </w:r>
           </w:p>
         </w:tc>
@@ -592,7 +592,7 @@
                 <w:color w:val="000000"/>
                 <w:sz w:val="19"/>
               </w:rPr>
-              <w:t>8.3%</w:t>
+              <w:t>3.6%</w:t>
             </w:r>
           </w:p>
         </w:tc>
@@ -700,7 +700,7 @@
                 <w:color w:val="000000"/>
                 <w:sz w:val="19"/>
               </w:rPr>
-              <w:t>3</w:t>
+              <w:t>5</w:t>
             </w:r>
           </w:p>
         </w:tc>
@@ -2295,7 +2295,7 @@
                 <w:color w:val="000000"/>
                 <w:sz w:val="19"/>
               </w:rPr>
-              <w:t>0分</w:t>
+              <w:t>65分 / 3.30km</w:t>
             </w:r>
           </w:p>
         </w:tc>
@@ -2322,7 +2322,7 @@
                 <w:color w:val="000000"/>
                 <w:sz w:val="19"/>
               </w:rPr>
-              <w:t>❌ 未執行</w:t>
+              <w:t>✅ 已完成</w:t>
             </w:r>
           </w:p>
         </w:tc>
@@ -3181,6 +3181,172 @@
                 <w:color w:val="000000"/>
                 <w:sz w:val="19"/>
               </w:rPr>
+              <w:t>08/08</w:t>
+              <w:br/>
+              <w:t>週六</w:t>
+            </w:r>
+          </w:p>
+        </w:tc>
+        <w:tc>
+          <w:tcPr>
+            <w:tcW w:type="dxa" w:w="3100"/>
+            <w:tcMar>
+              <w:top w:w="80" w:type="dxa"/>
+              <w:start w:w="120" w:type="dxa"/>
+              <w:bottom w:w="80" w:type="dxa"/>
+              <w:end w:w="120" w:type="dxa"/>
+            </w:tcMar>
+            <w:vAlign w:val="center"/>
+          </w:tcPr>
+          <w:p>
+            <w:pPr>
+              <w:spacing w:after="0"/>
+              <w:jc w:val="left"/>
+            </w:pPr>
+            <w:r>
+              <w:rPr>
+                <w:rFonts w:ascii="Calibri" w:hAnsi="Calibri" w:eastAsia="Microsoft JhengHei"/>
+                <w:b w:val="0"/>
+                <w:color w:val="000000"/>
+                <w:sz w:val="19"/>
+              </w:rPr>
+              <w:t>Bike: 3</w:t>
+            </w:r>
+          </w:p>
+        </w:tc>
+        <w:tc>
+          <w:tcPr>
+            <w:tcW w:type="dxa" w:w="1100"/>
+            <w:tcMar>
+              <w:top w:w="80" w:type="dxa"/>
+              <w:start w:w="120" w:type="dxa"/>
+              <w:bottom w:w="80" w:type="dxa"/>
+              <w:end w:w="120" w:type="dxa"/>
+            </w:tcMar>
+            <w:vAlign w:val="center"/>
+          </w:tcPr>
+          <w:p>
+            <w:pPr>
+              <w:spacing w:after="0"/>
+              <w:jc w:val="center"/>
+            </w:pPr>
+            <w:r>
+              <w:rPr>
+                <w:rFonts w:ascii="Calibri" w:hAnsi="Calibri" w:eastAsia="Microsoft JhengHei"/>
+                <w:b w:val="0"/>
+                <w:color w:val="000000"/>
+                <w:sz w:val="19"/>
+              </w:rPr>
+              <w:t>Bike</w:t>
+            </w:r>
+          </w:p>
+        </w:tc>
+        <w:tc>
+          <w:tcPr>
+            <w:tcW w:type="dxa" w:w="1600"/>
+            <w:tcMar>
+              <w:top w:w="80" w:type="dxa"/>
+              <w:start w:w="120" w:type="dxa"/>
+              <w:bottom w:w="80" w:type="dxa"/>
+              <w:end w:w="120" w:type="dxa"/>
+            </w:tcMar>
+            <w:vAlign w:val="center"/>
+          </w:tcPr>
+          <w:p>
+            <w:pPr>
+              <w:spacing w:after="0"/>
+              <w:jc w:val="center"/>
+            </w:pPr>
+            <w:r>
+              <w:rPr>
+                <w:rFonts w:ascii="Calibri" w:hAnsi="Calibri" w:eastAsia="Microsoft JhengHei"/>
+                <w:b w:val="0"/>
+                <w:color w:val="000000"/>
+                <w:sz w:val="19"/>
+              </w:rPr>
+              <w:t>180分</w:t>
+            </w:r>
+          </w:p>
+        </w:tc>
+        <w:tc>
+          <w:tcPr>
+            <w:tcW w:type="dxa" w:w="1600"/>
+            <w:tcMar>
+              <w:top w:w="80" w:type="dxa"/>
+              <w:start w:w="120" w:type="dxa"/>
+              <w:bottom w:w="80" w:type="dxa"/>
+              <w:end w:w="120" w:type="dxa"/>
+            </w:tcMar>
+            <w:vAlign w:val="center"/>
+          </w:tcPr>
+          <w:p>
+            <w:pPr>
+              <w:spacing w:after="0"/>
+              <w:jc w:val="center"/>
+            </w:pPr>
+            <w:r>
+              <w:rPr>
+                <w:rFonts w:ascii="Calibri" w:hAnsi="Calibri" w:eastAsia="Microsoft JhengHei"/>
+                <w:b w:val="0"/>
+                <w:color w:val="000000"/>
+                <w:sz w:val="19"/>
+              </w:rPr>
+              <w:t>0分</w:t>
+            </w:r>
+          </w:p>
+        </w:tc>
+        <w:tc>
+          <w:tcPr>
+            <w:tcW w:type="dxa" w:w="1160"/>
+            <w:tcMar>
+              <w:top w:w="80" w:type="dxa"/>
+              <w:start w:w="120" w:type="dxa"/>
+              <w:bottom w:w="80" w:type="dxa"/>
+              <w:end w:w="120" w:type="dxa"/>
+            </w:tcMar>
+            <w:vAlign w:val="center"/>
+          </w:tcPr>
+          <w:p>
+            <w:pPr>
+              <w:spacing w:after="0"/>
+              <w:jc w:val="center"/>
+            </w:pPr>
+            <w:r>
+              <w:rPr>
+                <w:rFonts w:ascii="Calibri" w:hAnsi="Calibri" w:eastAsia="Microsoft JhengHei"/>
+                <w:b w:val="0"/>
+                <w:color w:val="000000"/>
+                <w:sz w:val="19"/>
+              </w:rPr>
+              <w:t>❌ 未執行</w:t>
+            </w:r>
+          </w:p>
+        </w:tc>
+      </w:tr>
+      <w:tr>
+        <w:tc>
+          <w:tcPr>
+            <w:tcW w:type="dxa" w:w="1100"/>
+            <w:tcMar>
+              <w:top w:w="80" w:type="dxa"/>
+              <w:start w:w="120" w:type="dxa"/>
+              <w:bottom w:w="80" w:type="dxa"/>
+              <w:end w:w="120" w:type="dxa"/>
+            </w:tcMar>
+            <w:vAlign w:val="center"/>
+          </w:tcPr>
+          <w:p>
+            <w:pPr>
+              <w:spacing w:after="0"/>
+              <w:jc w:val="center"/>
+            </w:pPr>
+            <w:r>
+              <w:rPr>
+                <w:rFonts w:ascii="Calibri" w:hAnsi="Calibri" w:eastAsia="Microsoft JhengHei"/>
+                <w:b w:val="0"/>
+                <w:color w:val="000000"/>
+                <w:sz w:val="19"/>
+              </w:rPr>
               <w:t>08/09</w:t>
               <w:br/>
               <w:t>週日</w:t>
@@ -3431,6 +3597,172 @@
                 <w:sz w:val="19"/>
               </w:rPr>
               <w:t>90分 / 4.20km</w:t>
+            </w:r>
+          </w:p>
+        </w:tc>
+        <w:tc>
+          <w:tcPr>
+            <w:tcW w:type="dxa" w:w="1600"/>
+            <w:tcMar>
+              <w:top w:w="80" w:type="dxa"/>
+              <w:start w:w="120" w:type="dxa"/>
+              <w:bottom w:w="80" w:type="dxa"/>
+              <w:end w:w="120" w:type="dxa"/>
+            </w:tcMar>
+            <w:vAlign w:val="center"/>
+          </w:tcPr>
+          <w:p>
+            <w:pPr>
+              <w:spacing w:after="0"/>
+              <w:jc w:val="center"/>
+            </w:pPr>
+            <w:r>
+              <w:rPr>
+                <w:rFonts w:ascii="Calibri" w:hAnsi="Calibri" w:eastAsia="Microsoft JhengHei"/>
+                <w:b w:val="0"/>
+                <w:color w:val="000000"/>
+                <w:sz w:val="19"/>
+              </w:rPr>
+              <w:t>0分</w:t>
+            </w:r>
+          </w:p>
+        </w:tc>
+        <w:tc>
+          <w:tcPr>
+            <w:tcW w:type="dxa" w:w="1160"/>
+            <w:tcMar>
+              <w:top w:w="80" w:type="dxa"/>
+              <w:start w:w="120" w:type="dxa"/>
+              <w:bottom w:w="80" w:type="dxa"/>
+              <w:end w:w="120" w:type="dxa"/>
+            </w:tcMar>
+            <w:vAlign w:val="center"/>
+          </w:tcPr>
+          <w:p>
+            <w:pPr>
+              <w:spacing w:after="0"/>
+              <w:jc w:val="center"/>
+            </w:pPr>
+            <w:r>
+              <w:rPr>
+                <w:rFonts w:ascii="Calibri" w:hAnsi="Calibri" w:eastAsia="Microsoft JhengHei"/>
+                <w:b w:val="0"/>
+                <w:color w:val="000000"/>
+                <w:sz w:val="19"/>
+              </w:rPr>
+              <w:t>❌ 未執行</w:t>
+            </w:r>
+          </w:p>
+        </w:tc>
+      </w:tr>
+      <w:tr>
+        <w:tc>
+          <w:tcPr>
+            <w:tcW w:type="dxa" w:w="1100"/>
+            <w:tcMar>
+              <w:top w:w="80" w:type="dxa"/>
+              <w:start w:w="120" w:type="dxa"/>
+              <w:bottom w:w="80" w:type="dxa"/>
+              <w:end w:w="120" w:type="dxa"/>
+            </w:tcMar>
+            <w:vAlign w:val="center"/>
+          </w:tcPr>
+          <w:p>
+            <w:pPr>
+              <w:spacing w:after="0"/>
+              <w:jc w:val="center"/>
+            </w:pPr>
+            <w:r>
+              <w:rPr>
+                <w:rFonts w:ascii="Calibri" w:hAnsi="Calibri" w:eastAsia="Microsoft JhengHei"/>
+                <w:b w:val="0"/>
+                <w:color w:val="000000"/>
+                <w:sz w:val="19"/>
+              </w:rPr>
+              <w:t>08/09</w:t>
+              <w:br/>
+              <w:t>週日</w:t>
+            </w:r>
+          </w:p>
+        </w:tc>
+        <w:tc>
+          <w:tcPr>
+            <w:tcW w:type="dxa" w:w="3100"/>
+            <w:tcMar>
+              <w:top w:w="80" w:type="dxa"/>
+              <w:start w:w="120" w:type="dxa"/>
+              <w:bottom w:w="80" w:type="dxa"/>
+              <w:end w:w="120" w:type="dxa"/>
+            </w:tcMar>
+            <w:vAlign w:val="center"/>
+          </w:tcPr>
+          <w:p>
+            <w:pPr>
+              <w:spacing w:after="0"/>
+              <w:jc w:val="left"/>
+            </w:pPr>
+            <w:r>
+              <w:rPr>
+                <w:rFonts w:ascii="Calibri" w:hAnsi="Calibri" w:eastAsia="Microsoft JhengHei"/>
+                <w:b w:val="0"/>
+                <w:color w:val="000000"/>
+                <w:sz w:val="19"/>
+              </w:rPr>
+              <w:t>Bike: 5</w:t>
+            </w:r>
+          </w:p>
+        </w:tc>
+        <w:tc>
+          <w:tcPr>
+            <w:tcW w:type="dxa" w:w="1100"/>
+            <w:tcMar>
+              <w:top w:w="80" w:type="dxa"/>
+              <w:start w:w="120" w:type="dxa"/>
+              <w:bottom w:w="80" w:type="dxa"/>
+              <w:end w:w="120" w:type="dxa"/>
+            </w:tcMar>
+            <w:vAlign w:val="center"/>
+          </w:tcPr>
+          <w:p>
+            <w:pPr>
+              <w:spacing w:after="0"/>
+              <w:jc w:val="center"/>
+            </w:pPr>
+            <w:r>
+              <w:rPr>
+                <w:rFonts w:ascii="Calibri" w:hAnsi="Calibri" w:eastAsia="Microsoft JhengHei"/>
+                <w:b w:val="0"/>
+                <w:color w:val="000000"/>
+                <w:sz w:val="19"/>
+              </w:rPr>
+              <w:t>Bike</w:t>
+            </w:r>
+          </w:p>
+        </w:tc>
+        <w:tc>
+          <w:tcPr>
+            <w:tcW w:type="dxa" w:w="1600"/>
+            <w:tcMar>
+              <w:top w:w="80" w:type="dxa"/>
+              <w:start w:w="120" w:type="dxa"/>
+              <w:bottom w:w="80" w:type="dxa"/>
+              <w:end w:w="120" w:type="dxa"/>
+            </w:tcMar>
+            <w:vAlign w:val="center"/>
+          </w:tcPr>
+          <w:p>
+            <w:pPr>
+              <w:spacing w:after="0"/>
+              <w:jc w:val="center"/>
+            </w:pPr>
+            <w:r>
+              <w:rPr>
+                <w:rFonts w:ascii="Calibri" w:hAnsi="Calibri" w:eastAsia="Microsoft JhengHei"/>
+                <w:b w:val="0"/>
+                <w:color w:val="000000"/>
+                <w:sz w:val="19"/>
+              </w:rPr>
+              <w:t>300分</w:t>
             </w:r>
           </w:p>
         </w:tc>

</xml_diff>

<commit_message>
Auto sync TP data and update W32 execution report [2026-08-06]
</commit_message>
<xml_diff>
--- a/docs/weekly/2026-W32_當週執行率回顧報告.docx
+++ b/docs/weekly/2026-W32_當週執行率回顧報告.docx
@@ -21,7 +21,7 @@
           <w:color w:val="555555"/>
           <w:sz w:val="20"/>
         </w:rPr>
-        <w:t>週期：2026/08/03–2026/08/09　｜　整體時間執行率：11.5%</w:t>
+        <w:t>週期：2026/08/03–2026/08/09　｜　整體時間執行率：30.5%</w:t>
       </w:r>
     </w:p>
     <w:p>
@@ -320,7 +320,7 @@
                 <w:color w:val="000000"/>
                 <w:sz w:val="19"/>
               </w:rPr>
-              <w:t>4.17 hr</w:t>
+              <w:t>5.50 hr</w:t>
             </w:r>
           </w:p>
         </w:tc>
@@ -347,7 +347,7 @@
                 <w:color w:val="000000"/>
                 <w:sz w:val="19"/>
               </w:rPr>
-              <w:t>1.08 hr</w:t>
+              <w:t>2.17 hr</w:t>
             </w:r>
           </w:p>
         </w:tc>
@@ -374,7 +374,7 @@
                 <w:color w:val="000000"/>
                 <w:sz w:val="19"/>
               </w:rPr>
-              <w:t>26.0%</w:t>
+              <w:t>39.4%</w:t>
             </w:r>
           </w:p>
         </w:tc>
@@ -428,7 +428,7 @@
                 <w:color w:val="000000"/>
                 <w:sz w:val="19"/>
               </w:rPr>
-              <w:t>3.30 km</w:t>
+              <w:t>6.60 km</w:t>
             </w:r>
           </w:p>
         </w:tc>
@@ -455,7 +455,7 @@
                 <w:color w:val="000000"/>
                 <w:sz w:val="19"/>
               </w:rPr>
-              <w:t>78.6%</w:t>
+              <w:t>157.1%</w:t>
             </w:r>
           </w:p>
         </w:tc>
@@ -482,7 +482,7 @@
                 <w:color w:val="000000"/>
                 <w:sz w:val="19"/>
               </w:rPr>
-              <w:t>3</w:t>
+              <w:t>4</w:t>
             </w:r>
           </w:p>
         </w:tc>
@@ -538,7 +538,7 @@
                 <w:color w:val="000000"/>
                 <w:sz w:val="19"/>
               </w:rPr>
-              <w:t>14.00 hr</w:t>
+              <w:t>15.50 hr</w:t>
             </w:r>
           </w:p>
         </w:tc>
@@ -565,7 +565,7 @@
                 <w:color w:val="000000"/>
                 <w:sz w:val="19"/>
               </w:rPr>
-              <w:t>0.50 hr</w:t>
+              <w:t>3.77 hr</w:t>
             </w:r>
           </w:p>
         </w:tc>
@@ -592,7 +592,7 @@
                 <w:color w:val="000000"/>
                 <w:sz w:val="19"/>
               </w:rPr>
-              <w:t>3.6%</w:t>
+              <w:t>24.3%</w:t>
             </w:r>
           </w:p>
         </w:tc>
@@ -646,7 +646,7 @@
                 <w:color w:val="000000"/>
                 <w:sz w:val="19"/>
               </w:rPr>
-              <w:t>7.45 km</w:t>
+              <w:t>67.12 km</w:t>
             </w:r>
           </w:p>
         </w:tc>
@@ -700,7 +700,7 @@
                 <w:color w:val="000000"/>
                 <w:sz w:val="19"/>
               </w:rPr>
-              <w:t>5</w:t>
+              <w:t>6</w:t>
             </w:r>
           </w:p>
         </w:tc>
@@ -756,7 +756,7 @@
                 <w:color w:val="000000"/>
                 <w:sz w:val="19"/>
               </w:rPr>
-              <w:t>7.75 hr</w:t>
+              <w:t>9.25 hr</w:t>
             </w:r>
           </w:p>
         </w:tc>
@@ -783,7 +783,7 @@
                 <w:color w:val="000000"/>
                 <w:sz w:val="19"/>
               </w:rPr>
-              <w:t>1.40 hr</w:t>
+              <w:t>3.28 hr</w:t>
             </w:r>
           </w:p>
         </w:tc>
@@ -810,7 +810,7 @@
                 <w:color w:val="000000"/>
                 <w:sz w:val="19"/>
               </w:rPr>
-              <w:t>18.1%</w:t>
+              <w:t>35.5%</w:t>
             </w:r>
           </w:p>
         </w:tc>
@@ -837,7 +837,7 @@
                 <w:color w:val="000000"/>
                 <w:sz w:val="19"/>
               </w:rPr>
-              <w:t>63.60 km</w:t>
+              <w:t>74.80 km</w:t>
             </w:r>
           </w:p>
         </w:tc>
@@ -864,7 +864,7 @@
                 <w:color w:val="000000"/>
                 <w:sz w:val="19"/>
               </w:rPr>
-              <w:t>11.58 km</w:t>
+              <w:t>27.72 km</w:t>
             </w:r>
           </w:p>
         </w:tc>
@@ -891,7 +891,7 @@
                 <w:color w:val="000000"/>
                 <w:sz w:val="19"/>
               </w:rPr>
-              <w:t>18.2%</w:t>
+              <w:t>37.1%</w:t>
             </w:r>
           </w:p>
         </w:tc>
@@ -918,7 +918,7 @@
                 <w:color w:val="000000"/>
                 <w:sz w:val="19"/>
               </w:rPr>
-              <w:t>5</w:t>
+              <w:t>6</w:t>
             </w:r>
           </w:p>
         </w:tc>
@@ -1687,6 +1687,172 @@
                 <w:color w:val="000000"/>
                 <w:sz w:val="19"/>
               </w:rPr>
+              <w:t>08/03</w:t>
+              <w:br/>
+              <w:t>週一</w:t>
+            </w:r>
+          </w:p>
+        </w:tc>
+        <w:tc>
+          <w:tcPr>
+            <w:tcW w:type="dxa" w:w="3100"/>
+            <w:tcMar>
+              <w:top w:w="80" w:type="dxa"/>
+              <w:start w:w="120" w:type="dxa"/>
+              <w:bottom w:w="80" w:type="dxa"/>
+              <w:end w:w="120" w:type="dxa"/>
+            </w:tcMar>
+            <w:vAlign w:val="center"/>
+          </w:tcPr>
+          <w:p>
+            <w:pPr>
+              <w:spacing w:after="0"/>
+              <w:jc w:val="left"/>
+            </w:pPr>
+            <w:r>
+              <w:rPr>
+                <w:rFonts w:ascii="Calibri" w:hAnsi="Calibri" w:eastAsia="Microsoft JhengHei"/>
+                <w:b w:val="0"/>
+                <w:color w:val="000000"/>
+                <w:sz w:val="19"/>
+              </w:rPr>
+              <w:t>Run: Running</w:t>
+            </w:r>
+          </w:p>
+        </w:tc>
+        <w:tc>
+          <w:tcPr>
+            <w:tcW w:type="dxa" w:w="1100"/>
+            <w:tcMar>
+              <w:top w:w="80" w:type="dxa"/>
+              <w:start w:w="120" w:type="dxa"/>
+              <w:bottom w:w="80" w:type="dxa"/>
+              <w:end w:w="120" w:type="dxa"/>
+            </w:tcMar>
+            <w:vAlign w:val="center"/>
+          </w:tcPr>
+          <w:p>
+            <w:pPr>
+              <w:spacing w:after="0"/>
+              <w:jc w:val="center"/>
+            </w:pPr>
+            <w:r>
+              <w:rPr>
+                <w:rFonts w:ascii="Calibri" w:hAnsi="Calibri" w:eastAsia="Microsoft JhengHei"/>
+                <w:b w:val="0"/>
+                <w:color w:val="000000"/>
+                <w:sz w:val="19"/>
+              </w:rPr>
+              <w:t>Run</w:t>
+            </w:r>
+          </w:p>
+        </w:tc>
+        <w:tc>
+          <w:tcPr>
+            <w:tcW w:type="dxa" w:w="1600"/>
+            <w:tcMar>
+              <w:top w:w="80" w:type="dxa"/>
+              <w:start w:w="120" w:type="dxa"/>
+              <w:bottom w:w="80" w:type="dxa"/>
+              <w:end w:w="120" w:type="dxa"/>
+            </w:tcMar>
+            <w:vAlign w:val="center"/>
+          </w:tcPr>
+          <w:p>
+            <w:pPr>
+              <w:spacing w:after="0"/>
+              <w:jc w:val="center"/>
+            </w:pPr>
+            <w:r>
+              <w:rPr>
+                <w:rFonts w:ascii="Calibri" w:hAnsi="Calibri" w:eastAsia="Microsoft JhengHei"/>
+                <w:b w:val="0"/>
+                <w:color w:val="000000"/>
+                <w:sz w:val="19"/>
+              </w:rPr>
+              <w:t>90分 / 11.20km</w:t>
+            </w:r>
+          </w:p>
+        </w:tc>
+        <w:tc>
+          <w:tcPr>
+            <w:tcW w:type="dxa" w:w="1600"/>
+            <w:tcMar>
+              <w:top w:w="80" w:type="dxa"/>
+              <w:start w:w="120" w:type="dxa"/>
+              <w:bottom w:w="80" w:type="dxa"/>
+              <w:end w:w="120" w:type="dxa"/>
+            </w:tcMar>
+            <w:vAlign w:val="center"/>
+          </w:tcPr>
+          <w:p>
+            <w:pPr>
+              <w:spacing w:after="0"/>
+              <w:jc w:val="center"/>
+            </w:pPr>
+            <w:r>
+              <w:rPr>
+                <w:rFonts w:ascii="Calibri" w:hAnsi="Calibri" w:eastAsia="Microsoft JhengHei"/>
+                <w:b w:val="0"/>
+                <w:color w:val="000000"/>
+                <w:sz w:val="19"/>
+              </w:rPr>
+              <w:t>84分 / 11.58km</w:t>
+            </w:r>
+          </w:p>
+        </w:tc>
+        <w:tc>
+          <w:tcPr>
+            <w:tcW w:type="dxa" w:w="1160"/>
+            <w:tcMar>
+              <w:top w:w="80" w:type="dxa"/>
+              <w:start w:w="120" w:type="dxa"/>
+              <w:bottom w:w="80" w:type="dxa"/>
+              <w:end w:w="120" w:type="dxa"/>
+            </w:tcMar>
+            <w:vAlign w:val="center"/>
+          </w:tcPr>
+          <w:p>
+            <w:pPr>
+              <w:spacing w:after="0"/>
+              <w:jc w:val="center"/>
+            </w:pPr>
+            <w:r>
+              <w:rPr>
+                <w:rFonts w:ascii="Calibri" w:hAnsi="Calibri" w:eastAsia="Microsoft JhengHei"/>
+                <w:b w:val="0"/>
+                <w:color w:val="000000"/>
+                <w:sz w:val="19"/>
+              </w:rPr>
+              <w:t>✅ 已完成</w:t>
+            </w:r>
+          </w:p>
+        </w:tc>
+      </w:tr>
+      <w:tr>
+        <w:tc>
+          <w:tcPr>
+            <w:tcW w:type="dxa" w:w="1100"/>
+            <w:tcMar>
+              <w:top w:w="80" w:type="dxa"/>
+              <w:start w:w="120" w:type="dxa"/>
+              <w:bottom w:w="80" w:type="dxa"/>
+              <w:end w:w="120" w:type="dxa"/>
+            </w:tcMar>
+            <w:vAlign w:val="center"/>
+          </w:tcPr>
+          <w:p>
+            <w:pPr>
+              <w:spacing w:after="0"/>
+              <w:jc w:val="center"/>
+            </w:pPr>
+            <w:r>
+              <w:rPr>
+                <w:rFonts w:ascii="Calibri" w:hAnsi="Calibri" w:eastAsia="Microsoft JhengHei"/>
+                <w:b w:val="0"/>
+                <w:color w:val="000000"/>
+                <w:sz w:val="19"/>
+              </w:rPr>
               <w:t>08/04</w:t>
               <w:br/>
               <w:t>週二</w:t>
@@ -2185,6 +2351,172 @@
                 <w:color w:val="000000"/>
                 <w:sz w:val="19"/>
               </w:rPr>
+              <w:t>08/04</w:t>
+              <w:br/>
+              <w:t>週二</w:t>
+            </w:r>
+          </w:p>
+        </w:tc>
+        <w:tc>
+          <w:tcPr>
+            <w:tcW w:type="dxa" w:w="3100"/>
+            <w:tcMar>
+              <w:top w:w="80" w:type="dxa"/>
+              <w:start w:w="120" w:type="dxa"/>
+              <w:bottom w:w="80" w:type="dxa"/>
+              <w:end w:w="120" w:type="dxa"/>
+            </w:tcMar>
+            <w:vAlign w:val="center"/>
+          </w:tcPr>
+          <w:p>
+            <w:pPr>
+              <w:spacing w:after="0"/>
+              <w:jc w:val="left"/>
+            </w:pPr>
+            <w:r>
+              <w:rPr>
+                <w:rFonts w:ascii="Calibri" w:hAnsi="Calibri" w:eastAsia="Microsoft JhengHei"/>
+                <w:b w:val="0"/>
+                <w:color w:val="000000"/>
+                <w:sz w:val="19"/>
+              </w:rPr>
+              <w:t>Swim: 甜甜課表</w:t>
+            </w:r>
+          </w:p>
+        </w:tc>
+        <w:tc>
+          <w:tcPr>
+            <w:tcW w:type="dxa" w:w="1100"/>
+            <w:tcMar>
+              <w:top w:w="80" w:type="dxa"/>
+              <w:start w:w="120" w:type="dxa"/>
+              <w:bottom w:w="80" w:type="dxa"/>
+              <w:end w:w="120" w:type="dxa"/>
+            </w:tcMar>
+            <w:vAlign w:val="center"/>
+          </w:tcPr>
+          <w:p>
+            <w:pPr>
+              <w:spacing w:after="0"/>
+              <w:jc w:val="center"/>
+            </w:pPr>
+            <w:r>
+              <w:rPr>
+                <w:rFonts w:ascii="Calibri" w:hAnsi="Calibri" w:eastAsia="Microsoft JhengHei"/>
+                <w:b w:val="0"/>
+                <w:color w:val="000000"/>
+                <w:sz w:val="19"/>
+              </w:rPr>
+              <w:t>Swim</w:t>
+            </w:r>
+          </w:p>
+        </w:tc>
+        <w:tc>
+          <w:tcPr>
+            <w:tcW w:type="dxa" w:w="1600"/>
+            <w:tcMar>
+              <w:top w:w="80" w:type="dxa"/>
+              <w:start w:w="120" w:type="dxa"/>
+              <w:bottom w:w="80" w:type="dxa"/>
+              <w:end w:w="120" w:type="dxa"/>
+            </w:tcMar>
+            <w:vAlign w:val="center"/>
+          </w:tcPr>
+          <w:p>
+            <w:pPr>
+              <w:spacing w:after="0"/>
+              <w:jc w:val="center"/>
+            </w:pPr>
+            <w:r>
+              <w:rPr>
+                <w:rFonts w:ascii="Calibri" w:hAnsi="Calibri" w:eastAsia="Microsoft JhengHei"/>
+                <w:b w:val="0"/>
+                <w:color w:val="000000"/>
+                <w:sz w:val="19"/>
+              </w:rPr>
+              <w:t>80分</w:t>
+            </w:r>
+          </w:p>
+        </w:tc>
+        <w:tc>
+          <w:tcPr>
+            <w:tcW w:type="dxa" w:w="1600"/>
+            <w:tcMar>
+              <w:top w:w="80" w:type="dxa"/>
+              <w:start w:w="120" w:type="dxa"/>
+              <w:bottom w:w="80" w:type="dxa"/>
+              <w:end w:w="120" w:type="dxa"/>
+            </w:tcMar>
+            <w:vAlign w:val="center"/>
+          </w:tcPr>
+          <w:p>
+            <w:pPr>
+              <w:spacing w:after="0"/>
+              <w:jc w:val="center"/>
+            </w:pPr>
+            <w:r>
+              <w:rPr>
+                <w:rFonts w:ascii="Calibri" w:hAnsi="Calibri" w:eastAsia="Microsoft JhengHei"/>
+                <w:b w:val="0"/>
+                <w:color w:val="000000"/>
+                <w:sz w:val="19"/>
+              </w:rPr>
+              <w:t>65分 / 3.30km</w:t>
+            </w:r>
+          </w:p>
+        </w:tc>
+        <w:tc>
+          <w:tcPr>
+            <w:tcW w:type="dxa" w:w="1160"/>
+            <w:tcMar>
+              <w:top w:w="80" w:type="dxa"/>
+              <w:start w:w="120" w:type="dxa"/>
+              <w:bottom w:w="80" w:type="dxa"/>
+              <w:end w:w="120" w:type="dxa"/>
+            </w:tcMar>
+            <w:vAlign w:val="center"/>
+          </w:tcPr>
+          <w:p>
+            <w:pPr>
+              <w:spacing w:after="0"/>
+              <w:jc w:val="center"/>
+            </w:pPr>
+            <w:r>
+              <w:rPr>
+                <w:rFonts w:ascii="Calibri" w:hAnsi="Calibri" w:eastAsia="Microsoft JhengHei"/>
+                <w:b w:val="0"/>
+                <w:color w:val="000000"/>
+                <w:sz w:val="19"/>
+              </w:rPr>
+              <w:t>✅ 已完成</w:t>
+            </w:r>
+          </w:p>
+        </w:tc>
+      </w:tr>
+      <w:tr>
+        <w:tc>
+          <w:tcPr>
+            <w:tcW w:type="dxa" w:w="1100"/>
+            <w:tcMar>
+              <w:top w:w="80" w:type="dxa"/>
+              <w:start w:w="120" w:type="dxa"/>
+              <w:bottom w:w="80" w:type="dxa"/>
+              <w:end w:w="120" w:type="dxa"/>
+            </w:tcMar>
+            <w:vAlign w:val="center"/>
+          </w:tcPr>
+          <w:p>
+            <w:pPr>
+              <w:spacing w:after="0"/>
+              <w:jc w:val="center"/>
+            </w:pPr>
+            <w:r>
+              <w:rPr>
+                <w:rFonts w:ascii="Calibri" w:hAnsi="Calibri" w:eastAsia="Microsoft JhengHei"/>
+                <w:b w:val="0"/>
+                <w:color w:val="000000"/>
+                <w:sz w:val="19"/>
+              </w:rPr>
               <w:t>08/05</w:t>
               <w:br/>
               <w:t>週三</w:t>
@@ -2296,6 +2628,172 @@
                 <w:sz w:val="19"/>
               </w:rPr>
               <w:t>65分 / 3.30km</w:t>
+            </w:r>
+          </w:p>
+        </w:tc>
+        <w:tc>
+          <w:tcPr>
+            <w:tcW w:type="dxa" w:w="1160"/>
+            <w:tcMar>
+              <w:top w:w="80" w:type="dxa"/>
+              <w:start w:w="120" w:type="dxa"/>
+              <w:bottom w:w="80" w:type="dxa"/>
+              <w:end w:w="120" w:type="dxa"/>
+            </w:tcMar>
+            <w:vAlign w:val="center"/>
+          </w:tcPr>
+          <w:p>
+            <w:pPr>
+              <w:spacing w:after="0"/>
+              <w:jc w:val="center"/>
+            </w:pPr>
+            <w:r>
+              <w:rPr>
+                <w:rFonts w:ascii="Calibri" w:hAnsi="Calibri" w:eastAsia="Microsoft JhengHei"/>
+                <w:b w:val="0"/>
+                <w:color w:val="000000"/>
+                <w:sz w:val="19"/>
+              </w:rPr>
+              <w:t>✅ 已完成</w:t>
+            </w:r>
+          </w:p>
+        </w:tc>
+      </w:tr>
+      <w:tr>
+        <w:tc>
+          <w:tcPr>
+            <w:tcW w:type="dxa" w:w="1100"/>
+            <w:tcMar>
+              <w:top w:w="80" w:type="dxa"/>
+              <w:start w:w="120" w:type="dxa"/>
+              <w:bottom w:w="80" w:type="dxa"/>
+              <w:end w:w="120" w:type="dxa"/>
+            </w:tcMar>
+            <w:vAlign w:val="center"/>
+          </w:tcPr>
+          <w:p>
+            <w:pPr>
+              <w:spacing w:after="0"/>
+              <w:jc w:val="center"/>
+            </w:pPr>
+            <w:r>
+              <w:rPr>
+                <w:rFonts w:ascii="Calibri" w:hAnsi="Calibri" w:eastAsia="Microsoft JhengHei"/>
+                <w:b w:val="0"/>
+                <w:color w:val="000000"/>
+                <w:sz w:val="19"/>
+              </w:rPr>
+              <w:t>08/05</w:t>
+              <w:br/>
+              <w:t>週三</w:t>
+            </w:r>
+          </w:p>
+        </w:tc>
+        <w:tc>
+          <w:tcPr>
+            <w:tcW w:type="dxa" w:w="3100"/>
+            <w:tcMar>
+              <w:top w:w="80" w:type="dxa"/>
+              <w:start w:w="120" w:type="dxa"/>
+              <w:bottom w:w="80" w:type="dxa"/>
+              <w:end w:w="120" w:type="dxa"/>
+            </w:tcMar>
+            <w:vAlign w:val="center"/>
+          </w:tcPr>
+          <w:p>
+            <w:pPr>
+              <w:spacing w:after="0"/>
+              <w:jc w:val="left"/>
+            </w:pPr>
+            <w:r>
+              <w:rPr>
+                <w:rFonts w:ascii="Calibri" w:hAnsi="Calibri" w:eastAsia="Microsoft JhengHei"/>
+                <w:b w:val="0"/>
+                <w:color w:val="000000"/>
+                <w:sz w:val="19"/>
+              </w:rPr>
+              <w:t>Bike: TEMPO 9'30 X 8</w:t>
+            </w:r>
+          </w:p>
+        </w:tc>
+        <w:tc>
+          <w:tcPr>
+            <w:tcW w:type="dxa" w:w="1100"/>
+            <w:tcMar>
+              <w:top w:w="80" w:type="dxa"/>
+              <w:start w:w="120" w:type="dxa"/>
+              <w:bottom w:w="80" w:type="dxa"/>
+              <w:end w:w="120" w:type="dxa"/>
+            </w:tcMar>
+            <w:vAlign w:val="center"/>
+          </w:tcPr>
+          <w:p>
+            <w:pPr>
+              <w:spacing w:after="0"/>
+              <w:jc w:val="center"/>
+            </w:pPr>
+            <w:r>
+              <w:rPr>
+                <w:rFonts w:ascii="Calibri" w:hAnsi="Calibri" w:eastAsia="Microsoft JhengHei"/>
+                <w:b w:val="0"/>
+                <w:color w:val="000000"/>
+                <w:sz w:val="19"/>
+              </w:rPr>
+              <w:t>Bike</w:t>
+            </w:r>
+          </w:p>
+        </w:tc>
+        <w:tc>
+          <w:tcPr>
+            <w:tcW w:type="dxa" w:w="1600"/>
+            <w:tcMar>
+              <w:top w:w="80" w:type="dxa"/>
+              <w:start w:w="120" w:type="dxa"/>
+              <w:bottom w:w="80" w:type="dxa"/>
+              <w:end w:w="120" w:type="dxa"/>
+            </w:tcMar>
+            <w:vAlign w:val="center"/>
+          </w:tcPr>
+          <w:p>
+            <w:pPr>
+              <w:spacing w:after="0"/>
+              <w:jc w:val="center"/>
+            </w:pPr>
+            <w:r>
+              <w:rPr>
+                <w:rFonts w:ascii="Calibri" w:hAnsi="Calibri" w:eastAsia="Microsoft JhengHei"/>
+                <w:b w:val="0"/>
+                <w:color w:val="000000"/>
+                <w:sz w:val="19"/>
+              </w:rPr>
+              <w:t>90分</w:t>
+            </w:r>
+          </w:p>
+        </w:tc>
+        <w:tc>
+          <w:tcPr>
+            <w:tcW w:type="dxa" w:w="1600"/>
+            <w:tcMar>
+              <w:top w:w="80" w:type="dxa"/>
+              <w:start w:w="120" w:type="dxa"/>
+              <w:bottom w:w="80" w:type="dxa"/>
+              <w:end w:w="120" w:type="dxa"/>
+            </w:tcMar>
+            <w:vAlign w:val="center"/>
+          </w:tcPr>
+          <w:p>
+            <w:pPr>
+              <w:spacing w:after="0"/>
+              <w:jc w:val="center"/>
+            </w:pPr>
+            <w:r>
+              <w:rPr>
+                <w:rFonts w:ascii="Calibri" w:hAnsi="Calibri" w:eastAsia="Microsoft JhengHei"/>
+                <w:b w:val="0"/>
+                <w:color w:val="000000"/>
+                <w:sz w:val="19"/>
+              </w:rPr>
+              <w:t>196分 / 59.67km</w:t>
             </w:r>
           </w:p>
         </w:tc>
@@ -2627,7 +3125,7 @@
                 <w:color w:val="000000"/>
                 <w:sz w:val="19"/>
               </w:rPr>
-              <w:t>0分</w:t>
+              <w:t>29分 / 4.56km</w:t>
             </w:r>
           </w:p>
         </w:tc>
@@ -2654,7 +3152,7 @@
                 <w:color w:val="000000"/>
                 <w:sz w:val="19"/>
               </w:rPr>
-              <w:t>❌ 未執行</w:t>
+              <w:t>✅ 已完成</w:t>
             </w:r>
           </w:p>
         </w:tc>

</xml_diff>

<commit_message>
Auto Daily 8:00 PM Dashboard Update [2026-08-06 20:01]
</commit_message>
<xml_diff>
--- a/docs/weekly/2026-W32_當週執行率回顧報告.docx
+++ b/docs/weekly/2026-W32_當週執行率回顧報告.docx
@@ -21,7 +21,7 @@
           <w:color w:val="555555"/>
           <w:sz w:val="20"/>
         </w:rPr>
-        <w:t>週期：2026/08/03–2026/08/09　｜　整體時間執行率：30.5%</w:t>
+        <w:t>週期：2026/08/03–2026/08/09　｜　整體時間執行率：41.3%</w:t>
       </w:r>
     </w:p>
     <w:p>
@@ -565,7 +565,7 @@
                 <w:color w:val="000000"/>
                 <w:sz w:val="19"/>
               </w:rPr>
-              <w:t>3.77 hr</w:t>
+              <w:t>7.03 hr</w:t>
             </w:r>
           </w:p>
         </w:tc>
@@ -592,7 +592,7 @@
                 <w:color w:val="000000"/>
                 <w:sz w:val="19"/>
               </w:rPr>
-              <w:t>24.3%</w:t>
+              <w:t>45.4%</w:t>
             </w:r>
           </w:p>
         </w:tc>
@@ -646,7 +646,7 @@
                 <w:color w:val="000000"/>
                 <w:sz w:val="19"/>
               </w:rPr>
-              <w:t>67.12 km</w:t>
+              <w:t>126.79 km</w:t>
             </w:r>
           </w:p>
         </w:tc>
@@ -2959,7 +2959,7 @@
                 <w:color w:val="000000"/>
                 <w:sz w:val="19"/>
               </w:rPr>
-              <w:t>0分</w:t>
+              <w:t>196分 / 59.67km</w:t>
             </w:r>
           </w:p>
         </w:tc>
@@ -2986,7 +2986,7 @@
                 <w:color w:val="000000"/>
                 <w:sz w:val="19"/>
               </w:rPr>
-              <w:t>❌ 未執行</w:t>
+              <w:t>✅ 已完成</w:t>
             </w:r>
           </w:p>
         </w:tc>

</xml_diff>

<commit_message>
Auto Daily 8:00 PM Dashboard Update [2026-08-07 09:31]
</commit_message>
<xml_diff>
--- a/docs/weekly/2026-W32_當週執行率回顧報告.docx
+++ b/docs/weekly/2026-W32_當週執行率回顧報告.docx
@@ -21,7 +21,7 @@
           <w:color w:val="555555"/>
           <w:sz w:val="20"/>
         </w:rPr>
-        <w:t>週期：2026/08/03–2026/08/09　｜　整體時間執行率：41.3%</w:t>
+        <w:t>週期：2026/08/03–2026/08/09　｜　整體時間執行率：45.0%</w:t>
       </w:r>
     </w:p>
     <w:p>
@@ -347,7 +347,7 @@
                 <w:color w:val="000000"/>
                 <w:sz w:val="19"/>
               </w:rPr>
-              <w:t>2.17 hr</w:t>
+              <w:t>3.28 hr</w:t>
             </w:r>
           </w:p>
         </w:tc>
@@ -374,7 +374,7 @@
                 <w:color w:val="000000"/>
                 <w:sz w:val="19"/>
               </w:rPr>
-              <w:t>39.4%</w:t>
+              <w:t>59.7%</w:t>
             </w:r>
           </w:p>
         </w:tc>
@@ -428,7 +428,7 @@
                 <w:color w:val="000000"/>
                 <w:sz w:val="19"/>
               </w:rPr>
-              <w:t>6.60 km</w:t>
+              <w:t>10.00 km</w:t>
             </w:r>
           </w:p>
         </w:tc>
@@ -455,7 +455,7 @@
                 <w:color w:val="000000"/>
                 <w:sz w:val="19"/>
               </w:rPr>
-              <w:t>157.1%</w:t>
+              <w:t>238.1%</w:t>
             </w:r>
           </w:p>
         </w:tc>
@@ -3291,7 +3291,7 @@
                 <w:color w:val="000000"/>
                 <w:sz w:val="19"/>
               </w:rPr>
-              <w:t>0分</w:t>
+              <w:t>67分 / 3.40km</w:t>
             </w:r>
           </w:p>
         </w:tc>
@@ -3318,7 +3318,7 @@
                 <w:color w:val="000000"/>
                 <w:sz w:val="19"/>
               </w:rPr>
-              <w:t>❌ 未執行</w:t>
+              <w:t>✅ 已完成</w:t>
             </w:r>
           </w:p>
         </w:tc>

</xml_diff>

<commit_message>
Auto Daily 8:00 PM Dashboard Update [2026-08-08 15:24]
</commit_message>
<xml_diff>
--- a/docs/weekly/2026-W32_當週執行率回顧報告.docx
+++ b/docs/weekly/2026-W32_當週執行率回顧報告.docx
@@ -21,7 +21,7 @@
           <w:color w:val="555555"/>
           <w:sz w:val="20"/>
         </w:rPr>
-        <w:t>週期：2026/08/03–2026/08/09　｜　整體時間執行率：45.0%</w:t>
+        <w:t>週期：2026/08/03–2026/08/09　｜　整體時間執行率：57.3%</w:t>
       </w:r>
     </w:p>
     <w:p>
@@ -565,7 +565,7 @@
                 <w:color w:val="000000"/>
                 <w:sz w:val="19"/>
               </w:rPr>
-              <w:t>7.03 hr</w:t>
+              <w:t>10.03 hr</w:t>
             </w:r>
           </w:p>
         </w:tc>
@@ -592,7 +592,7 @@
                 <w:color w:val="000000"/>
                 <w:sz w:val="19"/>
               </w:rPr>
-              <w:t>45.4%</w:t>
+              <w:t>64.7%</w:t>
             </w:r>
           </w:p>
         </w:tc>
@@ -646,7 +646,7 @@
                 <w:color w:val="000000"/>
                 <w:sz w:val="19"/>
               </w:rPr>
-              <w:t>126.79 km</w:t>
+              <w:t>217.63 km</w:t>
             </w:r>
           </w:p>
         </w:tc>
@@ -783,7 +783,7 @@
                 <w:color w:val="000000"/>
                 <w:sz w:val="19"/>
               </w:rPr>
-              <w:t>3.28 hr</w:t>
+              <w:t>4.02 hr</w:t>
             </w:r>
           </w:p>
         </w:tc>
@@ -810,7 +810,7 @@
                 <w:color w:val="000000"/>
                 <w:sz w:val="19"/>
               </w:rPr>
-              <w:t>35.5%</w:t>
+              <w:t>43.4%</w:t>
             </w:r>
           </w:p>
         </w:tc>
@@ -864,7 +864,7 @@
                 <w:color w:val="000000"/>
                 <w:sz w:val="19"/>
               </w:rPr>
-              <w:t>27.72 km</w:t>
+              <w:t>34.54 km</w:t>
             </w:r>
           </w:p>
         </w:tc>
@@ -891,7 +891,7 @@
                 <w:color w:val="000000"/>
                 <w:sz w:val="19"/>
               </w:rPr>
-              <w:t>37.1%</w:t>
+              <w:t>46.2%</w:t>
             </w:r>
           </w:p>
         </w:tc>
@@ -918,7 +918,7 @@
                 <w:color w:val="000000"/>
                 <w:sz w:val="19"/>
               </w:rPr>
-              <w:t>6</w:t>
+              <w:t>7</w:t>
             </w:r>
           </w:p>
         </w:tc>
@@ -3789,7 +3789,7 @@
                 <w:color w:val="000000"/>
                 <w:sz w:val="19"/>
               </w:rPr>
-              <w:t>0分</w:t>
+              <w:t>180分 / 90.84km</w:t>
             </w:r>
           </w:p>
         </w:tc>
@@ -3816,7 +3816,339 @@
                 <w:color w:val="000000"/>
                 <w:sz w:val="19"/>
               </w:rPr>
-              <w:t>❌ 未執行</w:t>
+              <w:t>✅ 已完成</w:t>
+            </w:r>
+          </w:p>
+        </w:tc>
+      </w:tr>
+      <w:tr>
+        <w:tc>
+          <w:tcPr>
+            <w:tcW w:type="dxa" w:w="1100"/>
+            <w:tcMar>
+              <w:top w:w="80" w:type="dxa"/>
+              <w:start w:w="120" w:type="dxa"/>
+              <w:bottom w:w="80" w:type="dxa"/>
+              <w:end w:w="120" w:type="dxa"/>
+            </w:tcMar>
+            <w:vAlign w:val="center"/>
+          </w:tcPr>
+          <w:p>
+            <w:pPr>
+              <w:spacing w:after="0"/>
+              <w:jc w:val="center"/>
+            </w:pPr>
+            <w:r>
+              <w:rPr>
+                <w:rFonts w:ascii="Calibri" w:hAnsi="Calibri" w:eastAsia="Microsoft JhengHei"/>
+                <w:b w:val="0"/>
+                <w:color w:val="000000"/>
+                <w:sz w:val="19"/>
+              </w:rPr>
+              <w:t>08/08</w:t>
+              <w:br/>
+              <w:t>週六</w:t>
+            </w:r>
+          </w:p>
+        </w:tc>
+        <w:tc>
+          <w:tcPr>
+            <w:tcW w:type="dxa" w:w="3100"/>
+            <w:tcMar>
+              <w:top w:w="80" w:type="dxa"/>
+              <w:start w:w="120" w:type="dxa"/>
+              <w:bottom w:w="80" w:type="dxa"/>
+              <w:end w:w="120" w:type="dxa"/>
+            </w:tcMar>
+            <w:vAlign w:val="center"/>
+          </w:tcPr>
+          <w:p>
+            <w:pPr>
+              <w:spacing w:after="0"/>
+              <w:jc w:val="left"/>
+            </w:pPr>
+            <w:r>
+              <w:rPr>
+                <w:rFonts w:ascii="Calibri" w:hAnsi="Calibri" w:eastAsia="Microsoft JhengHei"/>
+                <w:b w:val="0"/>
+                <w:color w:val="000000"/>
+                <w:sz w:val="19"/>
+              </w:rPr>
+              <w:t>Run: Running</w:t>
+            </w:r>
+          </w:p>
+        </w:tc>
+        <w:tc>
+          <w:tcPr>
+            <w:tcW w:type="dxa" w:w="1100"/>
+            <w:tcMar>
+              <w:top w:w="80" w:type="dxa"/>
+              <w:start w:w="120" w:type="dxa"/>
+              <w:bottom w:w="80" w:type="dxa"/>
+              <w:end w:w="120" w:type="dxa"/>
+            </w:tcMar>
+            <w:vAlign w:val="center"/>
+          </w:tcPr>
+          <w:p>
+            <w:pPr>
+              <w:spacing w:after="0"/>
+              <w:jc w:val="center"/>
+            </w:pPr>
+            <w:r>
+              <w:rPr>
+                <w:rFonts w:ascii="Calibri" w:hAnsi="Calibri" w:eastAsia="Microsoft JhengHei"/>
+                <w:b w:val="0"/>
+                <w:color w:val="000000"/>
+                <w:sz w:val="19"/>
+              </w:rPr>
+              <w:t>Run</w:t>
+            </w:r>
+          </w:p>
+        </w:tc>
+        <w:tc>
+          <w:tcPr>
+            <w:tcW w:type="dxa" w:w="1600"/>
+            <w:tcMar>
+              <w:top w:w="80" w:type="dxa"/>
+              <w:start w:w="120" w:type="dxa"/>
+              <w:bottom w:w="80" w:type="dxa"/>
+              <w:end w:w="120" w:type="dxa"/>
+            </w:tcMar>
+            <w:vAlign w:val="center"/>
+          </w:tcPr>
+          <w:p>
+            <w:pPr>
+              <w:spacing w:after="0"/>
+              <w:jc w:val="center"/>
+            </w:pPr>
+            <w:r>
+              <w:rPr>
+                <w:rFonts w:ascii="Calibri" w:hAnsi="Calibri" w:eastAsia="Microsoft JhengHei"/>
+                <w:b w:val="0"/>
+                <w:color w:val="000000"/>
+                <w:sz w:val="19"/>
+              </w:rPr>
+              <w:t>0分</w:t>
+            </w:r>
+          </w:p>
+        </w:tc>
+        <w:tc>
+          <w:tcPr>
+            <w:tcW w:type="dxa" w:w="1600"/>
+            <w:tcMar>
+              <w:top w:w="80" w:type="dxa"/>
+              <w:start w:w="120" w:type="dxa"/>
+              <w:bottom w:w="80" w:type="dxa"/>
+              <w:end w:w="120" w:type="dxa"/>
+            </w:tcMar>
+            <w:vAlign w:val="center"/>
+          </w:tcPr>
+          <w:p>
+            <w:pPr>
+              <w:spacing w:after="0"/>
+              <w:jc w:val="center"/>
+            </w:pPr>
+            <w:r>
+              <w:rPr>
+                <w:rFonts w:ascii="Calibri" w:hAnsi="Calibri" w:eastAsia="Microsoft JhengHei"/>
+                <w:b w:val="0"/>
+                <w:color w:val="000000"/>
+                <w:sz w:val="19"/>
+              </w:rPr>
+              <w:t>44分 / 6.82km</w:t>
+            </w:r>
+          </w:p>
+        </w:tc>
+        <w:tc>
+          <w:tcPr>
+            <w:tcW w:type="dxa" w:w="1160"/>
+            <w:tcMar>
+              <w:top w:w="80" w:type="dxa"/>
+              <w:start w:w="120" w:type="dxa"/>
+              <w:bottom w:w="80" w:type="dxa"/>
+              <w:end w:w="120" w:type="dxa"/>
+            </w:tcMar>
+            <w:vAlign w:val="center"/>
+          </w:tcPr>
+          <w:p>
+            <w:pPr>
+              <w:spacing w:after="0"/>
+              <w:jc w:val="center"/>
+            </w:pPr>
+            <w:r>
+              <w:rPr>
+                <w:rFonts w:ascii="Calibri" w:hAnsi="Calibri" w:eastAsia="Microsoft JhengHei"/>
+                <w:b w:val="0"/>
+                <w:color w:val="000000"/>
+                <w:sz w:val="19"/>
+              </w:rPr>
+              <w:t>✅ 已完成</w:t>
+            </w:r>
+          </w:p>
+        </w:tc>
+      </w:tr>
+      <w:tr>
+        <w:tc>
+          <w:tcPr>
+            <w:tcW w:type="dxa" w:w="1100"/>
+            <w:tcMar>
+              <w:top w:w="80" w:type="dxa"/>
+              <w:start w:w="120" w:type="dxa"/>
+              <w:bottom w:w="80" w:type="dxa"/>
+              <w:end w:w="120" w:type="dxa"/>
+            </w:tcMar>
+            <w:vAlign w:val="center"/>
+          </w:tcPr>
+          <w:p>
+            <w:pPr>
+              <w:spacing w:after="0"/>
+              <w:jc w:val="center"/>
+            </w:pPr>
+            <w:r>
+              <w:rPr>
+                <w:rFonts w:ascii="Calibri" w:hAnsi="Calibri" w:eastAsia="Microsoft JhengHei"/>
+                <w:b w:val="0"/>
+                <w:color w:val="000000"/>
+                <w:sz w:val="19"/>
+              </w:rPr>
+              <w:t>08/08</w:t>
+              <w:br/>
+              <w:t>週六</w:t>
+            </w:r>
+          </w:p>
+        </w:tc>
+        <w:tc>
+          <w:tcPr>
+            <w:tcW w:type="dxa" w:w="3100"/>
+            <w:tcMar>
+              <w:top w:w="80" w:type="dxa"/>
+              <w:start w:w="120" w:type="dxa"/>
+              <w:bottom w:w="80" w:type="dxa"/>
+              <w:end w:w="120" w:type="dxa"/>
+            </w:tcMar>
+            <w:vAlign w:val="center"/>
+          </w:tcPr>
+          <w:p>
+            <w:pPr>
+              <w:spacing w:after="0"/>
+              <w:jc w:val="left"/>
+            </w:pPr>
+            <w:r>
+              <w:rPr>
+                <w:rFonts w:ascii="Calibri" w:hAnsi="Calibri" w:eastAsia="Microsoft JhengHei"/>
+                <w:b w:val="0"/>
+                <w:color w:val="000000"/>
+                <w:sz w:val="19"/>
+              </w:rPr>
+              <w:t>Walk: Walking</w:t>
+            </w:r>
+          </w:p>
+        </w:tc>
+        <w:tc>
+          <w:tcPr>
+            <w:tcW w:type="dxa" w:w="1100"/>
+            <w:tcMar>
+              <w:top w:w="80" w:type="dxa"/>
+              <w:start w:w="120" w:type="dxa"/>
+              <w:bottom w:w="80" w:type="dxa"/>
+              <w:end w:w="120" w:type="dxa"/>
+            </w:tcMar>
+            <w:vAlign w:val="center"/>
+          </w:tcPr>
+          <w:p>
+            <w:pPr>
+              <w:spacing w:after="0"/>
+              <w:jc w:val="center"/>
+            </w:pPr>
+            <w:r>
+              <w:rPr>
+                <w:rFonts w:ascii="Calibri" w:hAnsi="Calibri" w:eastAsia="Microsoft JhengHei"/>
+                <w:b w:val="0"/>
+                <w:color w:val="000000"/>
+                <w:sz w:val="19"/>
+              </w:rPr>
+              <w:t>Other</w:t>
+            </w:r>
+          </w:p>
+        </w:tc>
+        <w:tc>
+          <w:tcPr>
+            <w:tcW w:type="dxa" w:w="1600"/>
+            <w:tcMar>
+              <w:top w:w="80" w:type="dxa"/>
+              <w:start w:w="120" w:type="dxa"/>
+              <w:bottom w:w="80" w:type="dxa"/>
+              <w:end w:w="120" w:type="dxa"/>
+            </w:tcMar>
+            <w:vAlign w:val="center"/>
+          </w:tcPr>
+          <w:p>
+            <w:pPr>
+              <w:spacing w:after="0"/>
+              <w:jc w:val="center"/>
+            </w:pPr>
+            <w:r>
+              <w:rPr>
+                <w:rFonts w:ascii="Calibri" w:hAnsi="Calibri" w:eastAsia="Microsoft JhengHei"/>
+                <w:b w:val="0"/>
+                <w:color w:val="000000"/>
+                <w:sz w:val="19"/>
+              </w:rPr>
+              <w:t>0分</w:t>
+            </w:r>
+          </w:p>
+        </w:tc>
+        <w:tc>
+          <w:tcPr>
+            <w:tcW w:type="dxa" w:w="1600"/>
+            <w:tcMar>
+              <w:top w:w="80" w:type="dxa"/>
+              <w:start w:w="120" w:type="dxa"/>
+              <w:bottom w:w="80" w:type="dxa"/>
+              <w:end w:w="120" w:type="dxa"/>
+            </w:tcMar>
+            <w:vAlign w:val="center"/>
+          </w:tcPr>
+          <w:p>
+            <w:pPr>
+              <w:spacing w:after="0"/>
+              <w:jc w:val="center"/>
+            </w:pPr>
+            <w:r>
+              <w:rPr>
+                <w:rFonts w:ascii="Calibri" w:hAnsi="Calibri" w:eastAsia="Microsoft JhengHei"/>
+                <w:b w:val="0"/>
+                <w:color w:val="000000"/>
+                <w:sz w:val="19"/>
+              </w:rPr>
+              <w:t>5分 / 0.36km</w:t>
+            </w:r>
+          </w:p>
+        </w:tc>
+        <w:tc>
+          <w:tcPr>
+            <w:tcW w:type="dxa" w:w="1160"/>
+            <w:tcMar>
+              <w:top w:w="80" w:type="dxa"/>
+              <w:start w:w="120" w:type="dxa"/>
+              <w:bottom w:w="80" w:type="dxa"/>
+              <w:end w:w="120" w:type="dxa"/>
+            </w:tcMar>
+            <w:vAlign w:val="center"/>
+          </w:tcPr>
+          <w:p>
+            <w:pPr>
+              <w:spacing w:after="0"/>
+              <w:jc w:val="center"/>
+            </w:pPr>
+            <w:r>
+              <w:rPr>
+                <w:rFonts w:ascii="Calibri" w:hAnsi="Calibri" w:eastAsia="Microsoft JhengHei"/>
+                <w:b w:val="0"/>
+                <w:color w:val="000000"/>
+                <w:sz w:val="19"/>
+              </w:rPr>
+              <w:t>✅ 已完成</w:t>
             </w:r>
           </w:p>
         </w:tc>

</xml_diff>

<commit_message>
fix(sync): resolve cache duplication issue using native TP UID
</commit_message>
<xml_diff>
--- a/docs/weekly/2026-W32_當週執行率回顧報告.docx
+++ b/docs/weekly/2026-W32_當週執行率回顧報告.docx
@@ -21,7 +21,7 @@
           <w:color w:val="555555"/>
           <w:sz w:val="20"/>
         </w:rPr>
-        <w:t>週期：2026/08/03–2026/08/09　｜　整體時間執行率：57.3%</w:t>
+        <w:t>週期：2026/08/03–2026/08/09　｜　整體時間執行率：98.0%</w:t>
       </w:r>
     </w:p>
     <w:p>
@@ -320,7 +320,7 @@
                 <w:color w:val="000000"/>
                 <w:sz w:val="19"/>
               </w:rPr>
-              <w:t>5.50 hr</w:t>
+              <w:t>4.00 hr</w:t>
             </w:r>
           </w:p>
         </w:tc>
@@ -374,7 +374,7 @@
                 <w:color w:val="000000"/>
                 <w:sz w:val="19"/>
               </w:rPr>
-              <w:t>59.7%</w:t>
+              <w:t>82.1%</w:t>
             </w:r>
           </w:p>
         </w:tc>
@@ -401,7 +401,7 @@
                 <w:color w:val="000000"/>
                 <w:sz w:val="19"/>
               </w:rPr>
-              <w:t>4.20 km</w:t>
+              <w:t>0.00 km</w:t>
             </w:r>
           </w:p>
         </w:tc>
@@ -455,7 +455,7 @@
                 <w:color w:val="000000"/>
                 <w:sz w:val="19"/>
               </w:rPr>
-              <w:t>238.1%</w:t>
+              <w:t>0.0%</w:t>
             </w:r>
           </w:p>
         </w:tc>
@@ -482,7 +482,7 @@
                 <w:color w:val="000000"/>
                 <w:sz w:val="19"/>
               </w:rPr>
-              <w:t>4</w:t>
+              <w:t>3</w:t>
             </w:r>
           </w:p>
         </w:tc>
@@ -538,7 +538,7 @@
                 <w:color w:val="000000"/>
                 <w:sz w:val="19"/>
               </w:rPr>
-              <w:t>15.50 hr</w:t>
+              <w:t>11.00 hr</w:t>
             </w:r>
           </w:p>
         </w:tc>
@@ -565,7 +565,7 @@
                 <w:color w:val="000000"/>
                 <w:sz w:val="19"/>
               </w:rPr>
-              <w:t>10.03 hr</w:t>
+              <w:t>12.05 hr</w:t>
             </w:r>
           </w:p>
         </w:tc>
@@ -592,7 +592,7 @@
                 <w:color w:val="000000"/>
                 <w:sz w:val="19"/>
               </w:rPr>
-              <w:t>64.7%</w:t>
+              <w:t>109.5%</w:t>
             </w:r>
           </w:p>
         </w:tc>
@@ -646,7 +646,7 @@
                 <w:color w:val="000000"/>
                 <w:sz w:val="19"/>
               </w:rPr>
-              <w:t>217.63 km</w:t>
+              <w:t>270.06 km</w:t>
             </w:r>
           </w:p>
         </w:tc>
@@ -700,7 +700,7 @@
                 <w:color w:val="000000"/>
                 <w:sz w:val="19"/>
               </w:rPr>
-              <w:t>6</w:t>
+              <w:t>5</w:t>
             </w:r>
           </w:p>
         </w:tc>
@@ -756,7 +756,7 @@
                 <w:color w:val="000000"/>
                 <w:sz w:val="19"/>
               </w:rPr>
-              <w:t>9.25 hr</w:t>
+              <w:t>4.75 hr</w:t>
             </w:r>
           </w:p>
         </w:tc>
@@ -810,7 +810,7 @@
                 <w:color w:val="000000"/>
                 <w:sz w:val="19"/>
               </w:rPr>
-              <w:t>43.4%</w:t>
+              <w:t>84.6%</w:t>
             </w:r>
           </w:p>
         </w:tc>
@@ -837,7 +837,7 @@
                 <w:color w:val="000000"/>
                 <w:sz w:val="19"/>
               </w:rPr>
-              <w:t>74.80 km</w:t>
+              <w:t>39.40 km</w:t>
             </w:r>
           </w:p>
         </w:tc>
@@ -891,7 +891,7 @@
                 <w:color w:val="000000"/>
                 <w:sz w:val="19"/>
               </w:rPr>
-              <w:t>46.2%</w:t>
+              <w:t>87.7%</w:t>
             </w:r>
           </w:p>
         </w:tc>
@@ -918,7 +918,7 @@
                 <w:color w:val="000000"/>
                 <w:sz w:val="19"/>
               </w:rPr>
-              <w:t>7</w:t>
+              <w:t>4</w:t>
             </w:r>
           </w:p>
         </w:tc>
@@ -1936,172 +1936,6 @@
                 <w:color w:val="000000"/>
                 <w:sz w:val="19"/>
               </w:rPr>
-              <w:t>90分 / 12.40km</w:t>
-            </w:r>
-          </w:p>
-        </w:tc>
-        <w:tc>
-          <w:tcPr>
-            <w:tcW w:type="dxa" w:w="1600"/>
-            <w:tcMar>
-              <w:top w:w="80" w:type="dxa"/>
-              <w:start w:w="120" w:type="dxa"/>
-              <w:bottom w:w="80" w:type="dxa"/>
-              <w:end w:w="120" w:type="dxa"/>
-            </w:tcMar>
-            <w:vAlign w:val="center"/>
-          </w:tcPr>
-          <w:p>
-            <w:pPr>
-              <w:spacing w:after="0"/>
-              <w:jc w:val="center"/>
-            </w:pPr>
-            <w:r>
-              <w:rPr>
-                <w:rFonts w:ascii="Calibri" w:hAnsi="Calibri" w:eastAsia="Microsoft JhengHei"/>
-                <w:b w:val="0"/>
-                <w:color w:val="000000"/>
-                <w:sz w:val="19"/>
-              </w:rPr>
-              <w:t>0分</w:t>
-            </w:r>
-          </w:p>
-        </w:tc>
-        <w:tc>
-          <w:tcPr>
-            <w:tcW w:type="dxa" w:w="1160"/>
-            <w:tcMar>
-              <w:top w:w="80" w:type="dxa"/>
-              <w:start w:w="120" w:type="dxa"/>
-              <w:bottom w:w="80" w:type="dxa"/>
-              <w:end w:w="120" w:type="dxa"/>
-            </w:tcMar>
-            <w:vAlign w:val="center"/>
-          </w:tcPr>
-          <w:p>
-            <w:pPr>
-              <w:spacing w:after="0"/>
-              <w:jc w:val="center"/>
-            </w:pPr>
-            <w:r>
-              <w:rPr>
-                <w:rFonts w:ascii="Calibri" w:hAnsi="Calibri" w:eastAsia="Microsoft JhengHei"/>
-                <w:b w:val="0"/>
-                <w:color w:val="000000"/>
-                <w:sz w:val="19"/>
-              </w:rPr>
-              <w:t>❌ 未執行</w:t>
-            </w:r>
-          </w:p>
-        </w:tc>
-      </w:tr>
-      <w:tr>
-        <w:tc>
-          <w:tcPr>
-            <w:tcW w:type="dxa" w:w="1100"/>
-            <w:tcMar>
-              <w:top w:w="80" w:type="dxa"/>
-              <w:start w:w="120" w:type="dxa"/>
-              <w:bottom w:w="80" w:type="dxa"/>
-              <w:end w:w="120" w:type="dxa"/>
-            </w:tcMar>
-            <w:vAlign w:val="center"/>
-          </w:tcPr>
-          <w:p>
-            <w:pPr>
-              <w:spacing w:after="0"/>
-              <w:jc w:val="center"/>
-            </w:pPr>
-            <w:r>
-              <w:rPr>
-                <w:rFonts w:ascii="Calibri" w:hAnsi="Calibri" w:eastAsia="Microsoft JhengHei"/>
-                <w:b w:val="0"/>
-                <w:color w:val="000000"/>
-                <w:sz w:val="19"/>
-              </w:rPr>
-              <w:t>08/04</w:t>
-              <w:br/>
-              <w:t>週二</w:t>
-            </w:r>
-          </w:p>
-        </w:tc>
-        <w:tc>
-          <w:tcPr>
-            <w:tcW w:type="dxa" w:w="3100"/>
-            <w:tcMar>
-              <w:top w:w="80" w:type="dxa"/>
-              <w:start w:w="120" w:type="dxa"/>
-              <w:bottom w:w="80" w:type="dxa"/>
-              <w:end w:w="120" w:type="dxa"/>
-            </w:tcMar>
-            <w:vAlign w:val="center"/>
-          </w:tcPr>
-          <w:p>
-            <w:pPr>
-              <w:spacing w:after="0"/>
-              <w:jc w:val="left"/>
-            </w:pPr>
-            <w:r>
-              <w:rPr>
-                <w:rFonts w:ascii="Calibri" w:hAnsi="Calibri" w:eastAsia="Microsoft JhengHei"/>
-                <w:b w:val="0"/>
-                <w:color w:val="000000"/>
-                <w:sz w:val="19"/>
-              </w:rPr>
-              <w:t>Run: Running</w:t>
-            </w:r>
-          </w:p>
-        </w:tc>
-        <w:tc>
-          <w:tcPr>
-            <w:tcW w:type="dxa" w:w="1100"/>
-            <w:tcMar>
-              <w:top w:w="80" w:type="dxa"/>
-              <w:start w:w="120" w:type="dxa"/>
-              <w:bottom w:w="80" w:type="dxa"/>
-              <w:end w:w="120" w:type="dxa"/>
-            </w:tcMar>
-            <w:vAlign w:val="center"/>
-          </w:tcPr>
-          <w:p>
-            <w:pPr>
-              <w:spacing w:after="0"/>
-              <w:jc w:val="center"/>
-            </w:pPr>
-            <w:r>
-              <w:rPr>
-                <w:rFonts w:ascii="Calibri" w:hAnsi="Calibri" w:eastAsia="Microsoft JhengHei"/>
-                <w:b w:val="0"/>
-                <w:color w:val="000000"/>
-                <w:sz w:val="19"/>
-              </w:rPr>
-              <w:t>Run</w:t>
-            </w:r>
-          </w:p>
-        </w:tc>
-        <w:tc>
-          <w:tcPr>
-            <w:tcW w:type="dxa" w:w="1600"/>
-            <w:tcMar>
-              <w:top w:w="80" w:type="dxa"/>
-              <w:start w:w="120" w:type="dxa"/>
-              <w:bottom w:w="80" w:type="dxa"/>
-              <w:end w:w="120" w:type="dxa"/>
-            </w:tcMar>
-            <w:vAlign w:val="center"/>
-          </w:tcPr>
-          <w:p>
-            <w:pPr>
-              <w:spacing w:after="0"/>
-              <w:jc w:val="center"/>
-            </w:pPr>
-            <w:r>
-              <w:rPr>
-                <w:rFonts w:ascii="Calibri" w:hAnsi="Calibri" w:eastAsia="Microsoft JhengHei"/>
-                <w:b w:val="0"/>
-                <w:color w:val="000000"/>
-                <w:sz w:val="19"/>
-              </w:rPr>
               <w:t>90分 / 11.20km</w:t>
             </w:r>
           </w:p>
@@ -2546,7 +2380,7 @@
                 <w:color w:val="000000"/>
                 <w:sz w:val="19"/>
               </w:rPr>
-              <w:t>Swim: 甜甜課表</w:t>
+              <w:t>Bike: TEMPO 9'30 X 8</w:t>
             </w:r>
           </w:p>
         </w:tc>
@@ -2573,7 +2407,7 @@
                 <w:color w:val="000000"/>
                 <w:sz w:val="19"/>
               </w:rPr>
-              <w:t>Swim</w:t>
+              <w:t>Bike</w:t>
             </w:r>
           </w:p>
         </w:tc>
@@ -2600,7 +2434,7 @@
                 <w:color w:val="000000"/>
                 <w:sz w:val="19"/>
               </w:rPr>
-              <w:t>80分</w:t>
+              <w:t>90分</w:t>
             </w:r>
           </w:p>
         </w:tc>
@@ -2627,7 +2461,7 @@
                 <w:color w:val="000000"/>
                 <w:sz w:val="19"/>
               </w:rPr>
-              <w:t>65分 / 3.30km</w:t>
+              <w:t>196分 / 59.67km</w:t>
             </w:r>
           </w:p>
         </w:tc>
@@ -2712,7 +2546,7 @@
                 <w:color w:val="000000"/>
                 <w:sz w:val="19"/>
               </w:rPr>
-              <w:t>Bike: TEMPO 9'30 X 8</w:t>
+              <w:t>Swim: 甜甜課表</w:t>
             </w:r>
           </w:p>
         </w:tc>
@@ -2739,7 +2573,7 @@
                 <w:color w:val="000000"/>
                 <w:sz w:val="19"/>
               </w:rPr>
-              <w:t>Bike</w:t>
+              <w:t>Swim</w:t>
             </w:r>
           </w:p>
         </w:tc>
@@ -2766,7 +2600,7 @@
                 <w:color w:val="000000"/>
                 <w:sz w:val="19"/>
               </w:rPr>
-              <w:t>90分</w:t>
+              <w:t>80分</w:t>
             </w:r>
           </w:p>
         </w:tc>
@@ -2793,7 +2627,7 @@
                 <w:color w:val="000000"/>
                 <w:sz w:val="19"/>
               </w:rPr>
-              <w:t>196分 / 59.67km</w:t>
+              <w:t>65分 / 3.30km</w:t>
             </w:r>
           </w:p>
         </w:tc>
@@ -3376,338 +3210,6 @@
                 <w:color w:val="000000"/>
                 <w:sz w:val="19"/>
               </w:rPr>
-              <w:t>Bike: LSD 4.5</w:t>
-            </w:r>
-          </w:p>
-        </w:tc>
-        <w:tc>
-          <w:tcPr>
-            <w:tcW w:type="dxa" w:w="1100"/>
-            <w:tcMar>
-              <w:top w:w="80" w:type="dxa"/>
-              <w:start w:w="120" w:type="dxa"/>
-              <w:bottom w:w="80" w:type="dxa"/>
-              <w:end w:w="120" w:type="dxa"/>
-            </w:tcMar>
-            <w:vAlign w:val="center"/>
-          </w:tcPr>
-          <w:p>
-            <w:pPr>
-              <w:spacing w:after="0"/>
-              <w:jc w:val="center"/>
-            </w:pPr>
-            <w:r>
-              <w:rPr>
-                <w:rFonts w:ascii="Calibri" w:hAnsi="Calibri" w:eastAsia="Microsoft JhengHei"/>
-                <w:b w:val="0"/>
-                <w:color w:val="000000"/>
-                <w:sz w:val="19"/>
-              </w:rPr>
-              <w:t>Bike</w:t>
-            </w:r>
-          </w:p>
-        </w:tc>
-        <w:tc>
-          <w:tcPr>
-            <w:tcW w:type="dxa" w:w="1600"/>
-            <w:tcMar>
-              <w:top w:w="80" w:type="dxa"/>
-              <w:start w:w="120" w:type="dxa"/>
-              <w:bottom w:w="80" w:type="dxa"/>
-              <w:end w:w="120" w:type="dxa"/>
-            </w:tcMar>
-            <w:vAlign w:val="center"/>
-          </w:tcPr>
-          <w:p>
-            <w:pPr>
-              <w:spacing w:after="0"/>
-              <w:jc w:val="center"/>
-            </w:pPr>
-            <w:r>
-              <w:rPr>
-                <w:rFonts w:ascii="Calibri" w:hAnsi="Calibri" w:eastAsia="Microsoft JhengHei"/>
-                <w:b w:val="0"/>
-                <w:color w:val="000000"/>
-                <w:sz w:val="19"/>
-              </w:rPr>
-              <w:t>270分</w:t>
-            </w:r>
-          </w:p>
-        </w:tc>
-        <w:tc>
-          <w:tcPr>
-            <w:tcW w:type="dxa" w:w="1600"/>
-            <w:tcMar>
-              <w:top w:w="80" w:type="dxa"/>
-              <w:start w:w="120" w:type="dxa"/>
-              <w:bottom w:w="80" w:type="dxa"/>
-              <w:end w:w="120" w:type="dxa"/>
-            </w:tcMar>
-            <w:vAlign w:val="center"/>
-          </w:tcPr>
-          <w:p>
-            <w:pPr>
-              <w:spacing w:after="0"/>
-              <w:jc w:val="center"/>
-            </w:pPr>
-            <w:r>
-              <w:rPr>
-                <w:rFonts w:ascii="Calibri" w:hAnsi="Calibri" w:eastAsia="Microsoft JhengHei"/>
-                <w:b w:val="0"/>
-                <w:color w:val="000000"/>
-                <w:sz w:val="19"/>
-              </w:rPr>
-              <w:t>0分</w:t>
-            </w:r>
-          </w:p>
-        </w:tc>
-        <w:tc>
-          <w:tcPr>
-            <w:tcW w:type="dxa" w:w="1160"/>
-            <w:tcMar>
-              <w:top w:w="80" w:type="dxa"/>
-              <w:start w:w="120" w:type="dxa"/>
-              <w:bottom w:w="80" w:type="dxa"/>
-              <w:end w:w="120" w:type="dxa"/>
-            </w:tcMar>
-            <w:vAlign w:val="center"/>
-          </w:tcPr>
-          <w:p>
-            <w:pPr>
-              <w:spacing w:after="0"/>
-              <w:jc w:val="center"/>
-            </w:pPr>
-            <w:r>
-              <w:rPr>
-                <w:rFonts w:ascii="Calibri" w:hAnsi="Calibri" w:eastAsia="Microsoft JhengHei"/>
-                <w:b w:val="0"/>
-                <w:color w:val="000000"/>
-                <w:sz w:val="19"/>
-              </w:rPr>
-              <w:t>❌ 未執行</w:t>
-            </w:r>
-          </w:p>
-        </w:tc>
-      </w:tr>
-      <w:tr>
-        <w:tc>
-          <w:tcPr>
-            <w:tcW w:type="dxa" w:w="1100"/>
-            <w:tcMar>
-              <w:top w:w="80" w:type="dxa"/>
-              <w:start w:w="120" w:type="dxa"/>
-              <w:bottom w:w="80" w:type="dxa"/>
-              <w:end w:w="120" w:type="dxa"/>
-            </w:tcMar>
-            <w:vAlign w:val="center"/>
-          </w:tcPr>
-          <w:p>
-            <w:pPr>
-              <w:spacing w:after="0"/>
-              <w:jc w:val="center"/>
-            </w:pPr>
-            <w:r>
-              <w:rPr>
-                <w:rFonts w:ascii="Calibri" w:hAnsi="Calibri" w:eastAsia="Microsoft JhengHei"/>
-                <w:b w:val="0"/>
-                <w:color w:val="000000"/>
-                <w:sz w:val="19"/>
-              </w:rPr>
-              <w:t>08/08</w:t>
-              <w:br/>
-              <w:t>週六</w:t>
-            </w:r>
-          </w:p>
-        </w:tc>
-        <w:tc>
-          <w:tcPr>
-            <w:tcW w:type="dxa" w:w="3100"/>
-            <w:tcMar>
-              <w:top w:w="80" w:type="dxa"/>
-              <w:start w:w="120" w:type="dxa"/>
-              <w:bottom w:w="80" w:type="dxa"/>
-              <w:end w:w="120" w:type="dxa"/>
-            </w:tcMar>
-            <w:vAlign w:val="center"/>
-          </w:tcPr>
-          <w:p>
-            <w:pPr>
-              <w:spacing w:after="0"/>
-              <w:jc w:val="left"/>
-            </w:pPr>
-            <w:r>
-              <w:rPr>
-                <w:rFonts w:ascii="Calibri" w:hAnsi="Calibri" w:eastAsia="Microsoft JhengHei"/>
-                <w:b w:val="0"/>
-                <w:color w:val="000000"/>
-                <w:sz w:val="19"/>
-              </w:rPr>
-              <w:t>Run: 轉換75分</w:t>
-            </w:r>
-          </w:p>
-        </w:tc>
-        <w:tc>
-          <w:tcPr>
-            <w:tcW w:type="dxa" w:w="1100"/>
-            <w:tcMar>
-              <w:top w:w="80" w:type="dxa"/>
-              <w:start w:w="120" w:type="dxa"/>
-              <w:bottom w:w="80" w:type="dxa"/>
-              <w:end w:w="120" w:type="dxa"/>
-            </w:tcMar>
-            <w:vAlign w:val="center"/>
-          </w:tcPr>
-          <w:p>
-            <w:pPr>
-              <w:spacing w:after="0"/>
-              <w:jc w:val="center"/>
-            </w:pPr>
-            <w:r>
-              <w:rPr>
-                <w:rFonts w:ascii="Calibri" w:hAnsi="Calibri" w:eastAsia="Microsoft JhengHei"/>
-                <w:b w:val="0"/>
-                <w:color w:val="000000"/>
-                <w:sz w:val="19"/>
-              </w:rPr>
-              <w:t>Run</w:t>
-            </w:r>
-          </w:p>
-        </w:tc>
-        <w:tc>
-          <w:tcPr>
-            <w:tcW w:type="dxa" w:w="1600"/>
-            <w:tcMar>
-              <w:top w:w="80" w:type="dxa"/>
-              <w:start w:w="120" w:type="dxa"/>
-              <w:bottom w:w="80" w:type="dxa"/>
-              <w:end w:w="120" w:type="dxa"/>
-            </w:tcMar>
-            <w:vAlign w:val="center"/>
-          </w:tcPr>
-          <w:p>
-            <w:pPr>
-              <w:spacing w:after="0"/>
-              <w:jc w:val="center"/>
-            </w:pPr>
-            <w:r>
-              <w:rPr>
-                <w:rFonts w:ascii="Calibri" w:hAnsi="Calibri" w:eastAsia="Microsoft JhengHei"/>
-                <w:b w:val="0"/>
-                <w:color w:val="000000"/>
-                <w:sz w:val="19"/>
-              </w:rPr>
-              <w:t>75分 / 12.00km</w:t>
-            </w:r>
-          </w:p>
-        </w:tc>
-        <w:tc>
-          <w:tcPr>
-            <w:tcW w:type="dxa" w:w="1600"/>
-            <w:tcMar>
-              <w:top w:w="80" w:type="dxa"/>
-              <w:start w:w="120" w:type="dxa"/>
-              <w:bottom w:w="80" w:type="dxa"/>
-              <w:end w:w="120" w:type="dxa"/>
-            </w:tcMar>
-            <w:vAlign w:val="center"/>
-          </w:tcPr>
-          <w:p>
-            <w:pPr>
-              <w:spacing w:after="0"/>
-              <w:jc w:val="center"/>
-            </w:pPr>
-            <w:r>
-              <w:rPr>
-                <w:rFonts w:ascii="Calibri" w:hAnsi="Calibri" w:eastAsia="Microsoft JhengHei"/>
-                <w:b w:val="0"/>
-                <w:color w:val="000000"/>
-                <w:sz w:val="19"/>
-              </w:rPr>
-              <w:t>0分</w:t>
-            </w:r>
-          </w:p>
-        </w:tc>
-        <w:tc>
-          <w:tcPr>
-            <w:tcW w:type="dxa" w:w="1160"/>
-            <w:tcMar>
-              <w:top w:w="80" w:type="dxa"/>
-              <w:start w:w="120" w:type="dxa"/>
-              <w:bottom w:w="80" w:type="dxa"/>
-              <w:end w:w="120" w:type="dxa"/>
-            </w:tcMar>
-            <w:vAlign w:val="center"/>
-          </w:tcPr>
-          <w:p>
-            <w:pPr>
-              <w:spacing w:after="0"/>
-              <w:jc w:val="center"/>
-            </w:pPr>
-            <w:r>
-              <w:rPr>
-                <w:rFonts w:ascii="Calibri" w:hAnsi="Calibri" w:eastAsia="Microsoft JhengHei"/>
-                <w:b w:val="0"/>
-                <w:color w:val="000000"/>
-                <w:sz w:val="19"/>
-              </w:rPr>
-              <w:t>❌ 未執行</w:t>
-            </w:r>
-          </w:p>
-        </w:tc>
-      </w:tr>
-      <w:tr>
-        <w:tc>
-          <w:tcPr>
-            <w:tcW w:type="dxa" w:w="1100"/>
-            <w:tcMar>
-              <w:top w:w="80" w:type="dxa"/>
-              <w:start w:w="120" w:type="dxa"/>
-              <w:bottom w:w="80" w:type="dxa"/>
-              <w:end w:w="120" w:type="dxa"/>
-            </w:tcMar>
-            <w:vAlign w:val="center"/>
-          </w:tcPr>
-          <w:p>
-            <w:pPr>
-              <w:spacing w:after="0"/>
-              <w:jc w:val="center"/>
-            </w:pPr>
-            <w:r>
-              <w:rPr>
-                <w:rFonts w:ascii="Calibri" w:hAnsi="Calibri" w:eastAsia="Microsoft JhengHei"/>
-                <w:b w:val="0"/>
-                <w:color w:val="000000"/>
-                <w:sz w:val="19"/>
-              </w:rPr>
-              <w:t>08/08</w:t>
-              <w:br/>
-              <w:t>週六</w:t>
-            </w:r>
-          </w:p>
-        </w:tc>
-        <w:tc>
-          <w:tcPr>
-            <w:tcW w:type="dxa" w:w="3100"/>
-            <w:tcMar>
-              <w:top w:w="80" w:type="dxa"/>
-              <w:start w:w="120" w:type="dxa"/>
-              <w:bottom w:w="80" w:type="dxa"/>
-              <w:end w:w="120" w:type="dxa"/>
-            </w:tcMar>
-            <w:vAlign w:val="center"/>
-          </w:tcPr>
-          <w:p>
-            <w:pPr>
-              <w:spacing w:after="0"/>
-              <w:jc w:val="left"/>
-            </w:pPr>
-            <w:r>
-              <w:rPr>
-                <w:rFonts w:ascii="Calibri" w:hAnsi="Calibri" w:eastAsia="Microsoft JhengHei"/>
-                <w:b w:val="0"/>
-                <w:color w:val="000000"/>
-                <w:sz w:val="19"/>
-              </w:rPr>
               <w:t>Bike: 3</w:t>
             </w:r>
           </w:p>
@@ -3928,7 +3430,7 @@
                 <w:color w:val="000000"/>
                 <w:sz w:val="19"/>
               </w:rPr>
-              <w:t>0分</w:t>
+              <w:t>75分 / 12.00km</w:t>
             </w:r>
           </w:p>
         </w:tc>
@@ -4206,338 +3708,6 @@
                 <w:color w:val="000000"/>
                 <w:sz w:val="19"/>
               </w:rPr>
-              <w:t>Run: 福和橋～河濱～明德宮（補水則返）</w:t>
-            </w:r>
-          </w:p>
-        </w:tc>
-        <w:tc>
-          <w:tcPr>
-            <w:tcW w:type="dxa" w:w="1100"/>
-            <w:tcMar>
-              <w:top w:w="80" w:type="dxa"/>
-              <w:start w:w="120" w:type="dxa"/>
-              <w:bottom w:w="80" w:type="dxa"/>
-              <w:end w:w="120" w:type="dxa"/>
-            </w:tcMar>
-            <w:vAlign w:val="center"/>
-          </w:tcPr>
-          <w:p>
-            <w:pPr>
-              <w:spacing w:after="0"/>
-              <w:jc w:val="center"/>
-            </w:pPr>
-            <w:r>
-              <w:rPr>
-                <w:rFonts w:ascii="Calibri" w:hAnsi="Calibri" w:eastAsia="Microsoft JhengHei"/>
-                <w:b w:val="0"/>
-                <w:color w:val="000000"/>
-                <w:sz w:val="19"/>
-              </w:rPr>
-              <w:t>Run</w:t>
-            </w:r>
-          </w:p>
-        </w:tc>
-        <w:tc>
-          <w:tcPr>
-            <w:tcW w:type="dxa" w:w="1600"/>
-            <w:tcMar>
-              <w:top w:w="80" w:type="dxa"/>
-              <w:start w:w="120" w:type="dxa"/>
-              <w:bottom w:w="80" w:type="dxa"/>
-              <w:end w:w="120" w:type="dxa"/>
-            </w:tcMar>
-            <w:vAlign w:val="center"/>
-          </w:tcPr>
-          <w:p>
-            <w:pPr>
-              <w:spacing w:after="0"/>
-              <w:jc w:val="center"/>
-            </w:pPr>
-            <w:r>
-              <w:rPr>
-                <w:rFonts w:ascii="Calibri" w:hAnsi="Calibri" w:eastAsia="Microsoft JhengHei"/>
-                <w:b w:val="0"/>
-                <w:color w:val="000000"/>
-                <w:sz w:val="19"/>
-              </w:rPr>
-              <w:t>180分 / 23.00km</w:t>
-            </w:r>
-          </w:p>
-        </w:tc>
-        <w:tc>
-          <w:tcPr>
-            <w:tcW w:type="dxa" w:w="1600"/>
-            <w:tcMar>
-              <w:top w:w="80" w:type="dxa"/>
-              <w:start w:w="120" w:type="dxa"/>
-              <w:bottom w:w="80" w:type="dxa"/>
-              <w:end w:w="120" w:type="dxa"/>
-            </w:tcMar>
-            <w:vAlign w:val="center"/>
-          </w:tcPr>
-          <w:p>
-            <w:pPr>
-              <w:spacing w:after="0"/>
-              <w:jc w:val="center"/>
-            </w:pPr>
-            <w:r>
-              <w:rPr>
-                <w:rFonts w:ascii="Calibri" w:hAnsi="Calibri" w:eastAsia="Microsoft JhengHei"/>
-                <w:b w:val="0"/>
-                <w:color w:val="000000"/>
-                <w:sz w:val="19"/>
-              </w:rPr>
-              <w:t>0分</w:t>
-            </w:r>
-          </w:p>
-        </w:tc>
-        <w:tc>
-          <w:tcPr>
-            <w:tcW w:type="dxa" w:w="1160"/>
-            <w:tcMar>
-              <w:top w:w="80" w:type="dxa"/>
-              <w:start w:w="120" w:type="dxa"/>
-              <w:bottom w:w="80" w:type="dxa"/>
-              <w:end w:w="120" w:type="dxa"/>
-            </w:tcMar>
-            <w:vAlign w:val="center"/>
-          </w:tcPr>
-          <w:p>
-            <w:pPr>
-              <w:spacing w:after="0"/>
-              <w:jc w:val="center"/>
-            </w:pPr>
-            <w:r>
-              <w:rPr>
-                <w:rFonts w:ascii="Calibri" w:hAnsi="Calibri" w:eastAsia="Microsoft JhengHei"/>
-                <w:b w:val="0"/>
-                <w:color w:val="000000"/>
-                <w:sz w:val="19"/>
-              </w:rPr>
-              <w:t>❌ 未執行</w:t>
-            </w:r>
-          </w:p>
-        </w:tc>
-      </w:tr>
-      <w:tr>
-        <w:tc>
-          <w:tcPr>
-            <w:tcW w:type="dxa" w:w="1100"/>
-            <w:tcMar>
-              <w:top w:w="80" w:type="dxa"/>
-              <w:start w:w="120" w:type="dxa"/>
-              <w:bottom w:w="80" w:type="dxa"/>
-              <w:end w:w="120" w:type="dxa"/>
-            </w:tcMar>
-            <w:vAlign w:val="center"/>
-          </w:tcPr>
-          <w:p>
-            <w:pPr>
-              <w:spacing w:after="0"/>
-              <w:jc w:val="center"/>
-            </w:pPr>
-            <w:r>
-              <w:rPr>
-                <w:rFonts w:ascii="Calibri" w:hAnsi="Calibri" w:eastAsia="Microsoft JhengHei"/>
-                <w:b w:val="0"/>
-                <w:color w:val="000000"/>
-                <w:sz w:val="19"/>
-              </w:rPr>
-              <w:t>08/09</w:t>
-              <w:br/>
-              <w:t>週日</w:t>
-            </w:r>
-          </w:p>
-        </w:tc>
-        <w:tc>
-          <w:tcPr>
-            <w:tcW w:type="dxa" w:w="3100"/>
-            <w:tcMar>
-              <w:top w:w="80" w:type="dxa"/>
-              <w:start w:w="120" w:type="dxa"/>
-              <w:bottom w:w="80" w:type="dxa"/>
-              <w:end w:w="120" w:type="dxa"/>
-            </w:tcMar>
-            <w:vAlign w:val="center"/>
-          </w:tcPr>
-          <w:p>
-            <w:pPr>
-              <w:spacing w:after="0"/>
-              <w:jc w:val="left"/>
-            </w:pPr>
-            <w:r>
-              <w:rPr>
-                <w:rFonts w:ascii="Calibri" w:hAnsi="Calibri" w:eastAsia="Microsoft JhengHei"/>
-                <w:b w:val="0"/>
-                <w:color w:val="000000"/>
-                <w:sz w:val="19"/>
-              </w:rPr>
-              <w:t>Swim: 4200</w:t>
-            </w:r>
-          </w:p>
-        </w:tc>
-        <w:tc>
-          <w:tcPr>
-            <w:tcW w:type="dxa" w:w="1100"/>
-            <w:tcMar>
-              <w:top w:w="80" w:type="dxa"/>
-              <w:start w:w="120" w:type="dxa"/>
-              <w:bottom w:w="80" w:type="dxa"/>
-              <w:end w:w="120" w:type="dxa"/>
-            </w:tcMar>
-            <w:vAlign w:val="center"/>
-          </w:tcPr>
-          <w:p>
-            <w:pPr>
-              <w:spacing w:after="0"/>
-              <w:jc w:val="center"/>
-            </w:pPr>
-            <w:r>
-              <w:rPr>
-                <w:rFonts w:ascii="Calibri" w:hAnsi="Calibri" w:eastAsia="Microsoft JhengHei"/>
-                <w:b w:val="0"/>
-                <w:color w:val="000000"/>
-                <w:sz w:val="19"/>
-              </w:rPr>
-              <w:t>Swim</w:t>
-            </w:r>
-          </w:p>
-        </w:tc>
-        <w:tc>
-          <w:tcPr>
-            <w:tcW w:type="dxa" w:w="1600"/>
-            <w:tcMar>
-              <w:top w:w="80" w:type="dxa"/>
-              <w:start w:w="120" w:type="dxa"/>
-              <w:bottom w:w="80" w:type="dxa"/>
-              <w:end w:w="120" w:type="dxa"/>
-            </w:tcMar>
-            <w:vAlign w:val="center"/>
-          </w:tcPr>
-          <w:p>
-            <w:pPr>
-              <w:spacing w:after="0"/>
-              <w:jc w:val="center"/>
-            </w:pPr>
-            <w:r>
-              <w:rPr>
-                <w:rFonts w:ascii="Calibri" w:hAnsi="Calibri" w:eastAsia="Microsoft JhengHei"/>
-                <w:b w:val="0"/>
-                <w:color w:val="000000"/>
-                <w:sz w:val="19"/>
-              </w:rPr>
-              <w:t>90分 / 4.20km</w:t>
-            </w:r>
-          </w:p>
-        </w:tc>
-        <w:tc>
-          <w:tcPr>
-            <w:tcW w:type="dxa" w:w="1600"/>
-            <w:tcMar>
-              <w:top w:w="80" w:type="dxa"/>
-              <w:start w:w="120" w:type="dxa"/>
-              <w:bottom w:w="80" w:type="dxa"/>
-              <w:end w:w="120" w:type="dxa"/>
-            </w:tcMar>
-            <w:vAlign w:val="center"/>
-          </w:tcPr>
-          <w:p>
-            <w:pPr>
-              <w:spacing w:after="0"/>
-              <w:jc w:val="center"/>
-            </w:pPr>
-            <w:r>
-              <w:rPr>
-                <w:rFonts w:ascii="Calibri" w:hAnsi="Calibri" w:eastAsia="Microsoft JhengHei"/>
-                <w:b w:val="0"/>
-                <w:color w:val="000000"/>
-                <w:sz w:val="19"/>
-              </w:rPr>
-              <w:t>0分</w:t>
-            </w:r>
-          </w:p>
-        </w:tc>
-        <w:tc>
-          <w:tcPr>
-            <w:tcW w:type="dxa" w:w="1160"/>
-            <w:tcMar>
-              <w:top w:w="80" w:type="dxa"/>
-              <w:start w:w="120" w:type="dxa"/>
-              <w:bottom w:w="80" w:type="dxa"/>
-              <w:end w:w="120" w:type="dxa"/>
-            </w:tcMar>
-            <w:vAlign w:val="center"/>
-          </w:tcPr>
-          <w:p>
-            <w:pPr>
-              <w:spacing w:after="0"/>
-              <w:jc w:val="center"/>
-            </w:pPr>
-            <w:r>
-              <w:rPr>
-                <w:rFonts w:ascii="Calibri" w:hAnsi="Calibri" w:eastAsia="Microsoft JhengHei"/>
-                <w:b w:val="0"/>
-                <w:color w:val="000000"/>
-                <w:sz w:val="19"/>
-              </w:rPr>
-              <w:t>❌ 未執行</w:t>
-            </w:r>
-          </w:p>
-        </w:tc>
-      </w:tr>
-      <w:tr>
-        <w:tc>
-          <w:tcPr>
-            <w:tcW w:type="dxa" w:w="1100"/>
-            <w:tcMar>
-              <w:top w:w="80" w:type="dxa"/>
-              <w:start w:w="120" w:type="dxa"/>
-              <w:bottom w:w="80" w:type="dxa"/>
-              <w:end w:w="120" w:type="dxa"/>
-            </w:tcMar>
-            <w:vAlign w:val="center"/>
-          </w:tcPr>
-          <w:p>
-            <w:pPr>
-              <w:spacing w:after="0"/>
-              <w:jc w:val="center"/>
-            </w:pPr>
-            <w:r>
-              <w:rPr>
-                <w:rFonts w:ascii="Calibri" w:hAnsi="Calibri" w:eastAsia="Microsoft JhengHei"/>
-                <w:b w:val="0"/>
-                <w:color w:val="000000"/>
-                <w:sz w:val="19"/>
-              </w:rPr>
-              <w:t>08/09</w:t>
-              <w:br/>
-              <w:t>週日</w:t>
-            </w:r>
-          </w:p>
-        </w:tc>
-        <w:tc>
-          <w:tcPr>
-            <w:tcW w:type="dxa" w:w="3100"/>
-            <w:tcMar>
-              <w:top w:w="80" w:type="dxa"/>
-              <w:start w:w="120" w:type="dxa"/>
-              <w:bottom w:w="80" w:type="dxa"/>
-              <w:end w:w="120" w:type="dxa"/>
-            </w:tcMar>
-            <w:vAlign w:val="center"/>
-          </w:tcPr>
-          <w:p>
-            <w:pPr>
-              <w:spacing w:after="0"/>
-              <w:jc w:val="left"/>
-            </w:pPr>
-            <w:r>
-              <w:rPr>
-                <w:rFonts w:ascii="Calibri" w:hAnsi="Calibri" w:eastAsia="Microsoft JhengHei"/>
-                <w:b w:val="0"/>
-                <w:color w:val="000000"/>
-                <w:sz w:val="19"/>
-              </w:rPr>
               <w:t>Bike: 5</w:t>
             </w:r>
           </w:p>
@@ -4619,7 +3789,7 @@
                 <w:color w:val="000000"/>
                 <w:sz w:val="19"/>
               </w:rPr>
-              <w:t>0分</w:t>
+              <w:t>121分 / 52.43km</w:t>
             </w:r>
           </w:p>
         </w:tc>
@@ -4646,7 +3816,7 @@
                 <w:color w:val="000000"/>
                 <w:sz w:val="19"/>
               </w:rPr>
-              <w:t>❌ 未執行</w:t>
+              <w:t>✅ 已完成</w:t>
             </w:r>
           </w:p>
         </w:tc>

</xml_diff>

<commit_message>
feat(w33): sync calendar, generate W33 strength plan and weekly articles, update web dashboard
</commit_message>
<xml_diff>
--- a/docs/weekly/2026-W32_當週執行率回顧報告.docx
+++ b/docs/weekly/2026-W32_當週執行率回顧報告.docx
@@ -21,7 +21,7 @@
           <w:color w:val="555555"/>
           <w:sz w:val="20"/>
         </w:rPr>
-        <w:t>週期：2026/08/03–2026/08/09　｜　整體時間執行率：92.2%</w:t>
+        <w:t>週期：2026/08/03–2026/08/09　｜　整體時間執行率：89.8%</w:t>
       </w:r>
     </w:p>
     <w:p>
@@ -320,7 +320,7 @@
                 <w:color w:val="000000"/>
                 <w:sz w:val="19"/>
               </w:rPr>
-              <w:t>6.67 hr</w:t>
+              <w:t>9.33 hr</w:t>
             </w:r>
           </w:p>
         </w:tc>
@@ -347,7 +347,7 @@
                 <w:color w:val="000000"/>
                 <w:sz w:val="19"/>
               </w:rPr>
-              <w:t>5.48 hr</w:t>
+              <w:t>7.68 hr</w:t>
             </w:r>
           </w:p>
         </w:tc>
@@ -374,7 +374,7 @@
                 <w:color w:val="000000"/>
                 <w:sz w:val="19"/>
               </w:rPr>
-              <w:t>82.2%</w:t>
+              <w:t>82.3%</w:t>
             </w:r>
           </w:p>
         </w:tc>
@@ -428,7 +428,7 @@
                 <w:color w:val="000000"/>
                 <w:sz w:val="19"/>
               </w:rPr>
-              <w:t>16.70 km</w:t>
+              <w:t>23.40 km</w:t>
             </w:r>
           </w:p>
         </w:tc>
@@ -482,7 +482,7 @@
                 <w:color w:val="000000"/>
                 <w:sz w:val="19"/>
               </w:rPr>
-              <w:t>5</w:t>
+              <w:t>7</w:t>
             </w:r>
           </w:p>
         </w:tc>
@@ -538,7 +538,7 @@
                 <w:color w:val="000000"/>
                 <w:sz w:val="19"/>
               </w:rPr>
-              <w:t>20.50 hr</w:t>
+              <w:t>30.00 hr</w:t>
             </w:r>
           </w:p>
         </w:tc>
@@ -565,7 +565,7 @@
                 <w:color w:val="000000"/>
                 <w:sz w:val="19"/>
               </w:rPr>
-              <w:t>20.33 hr</w:t>
+              <w:t>28.62 hr</w:t>
             </w:r>
           </w:p>
         </w:tc>
@@ -592,7 +592,7 @@
                 <w:color w:val="000000"/>
                 <w:sz w:val="19"/>
               </w:rPr>
-              <w:t>99.2%</w:t>
+              <w:t>95.4%</w:t>
             </w:r>
           </w:p>
         </w:tc>
@@ -646,7 +646,7 @@
                 <w:color w:val="000000"/>
                 <w:sz w:val="19"/>
               </w:rPr>
-              <w:t>473.00 km</w:t>
+              <w:t>675.94 km</w:t>
             </w:r>
           </w:p>
         </w:tc>
@@ -700,7 +700,7 @@
                 <w:color w:val="000000"/>
                 <w:sz w:val="19"/>
               </w:rPr>
-              <w:t>8</w:t>
+              <w:t>11</w:t>
             </w:r>
           </w:p>
         </w:tc>
@@ -756,7 +756,7 @@
                 <w:color w:val="000000"/>
                 <w:sz w:val="19"/>
               </w:rPr>
-              <w:t>6.50 hr</w:t>
+              <w:t>8.25 hr</w:t>
             </w:r>
           </w:p>
         </w:tc>
@@ -783,7 +783,7 @@
                 <w:color w:val="000000"/>
                 <w:sz w:val="19"/>
               </w:rPr>
-              <w:t>5.23 hr</w:t>
+              <w:t>6.45 hr</w:t>
             </w:r>
           </w:p>
         </w:tc>
@@ -810,7 +810,7 @@
                 <w:color w:val="000000"/>
                 <w:sz w:val="19"/>
               </w:rPr>
-              <w:t>80.5%</w:t>
+              <w:t>78.2%</w:t>
             </w:r>
           </w:p>
         </w:tc>
@@ -837,7 +837,7 @@
                 <w:color w:val="000000"/>
                 <w:sz w:val="19"/>
               </w:rPr>
-              <w:t>56.40 km</w:t>
+              <w:t>73.40 km</w:t>
             </w:r>
           </w:p>
         </w:tc>
@@ -864,7 +864,7 @@
                 <w:color w:val="000000"/>
                 <w:sz w:val="19"/>
               </w:rPr>
-              <w:t>45.92 km</w:t>
+              <w:t>57.30 km</w:t>
             </w:r>
           </w:p>
         </w:tc>
@@ -891,7 +891,7 @@
                 <w:color w:val="000000"/>
                 <w:sz w:val="19"/>
               </w:rPr>
-              <w:t>81.4%</w:t>
+              <w:t>78.1%</w:t>
             </w:r>
           </w:p>
         </w:tc>
@@ -918,7 +918,7 @@
                 <w:color w:val="000000"/>
                 <w:sz w:val="19"/>
               </w:rPr>
-              <w:t>6</w:t>
+              <w:t>8</w:t>
             </w:r>
           </w:p>
         </w:tc>
@@ -2849,6 +2849,172 @@
                 <w:color w:val="000000"/>
                 <w:sz w:val="19"/>
               </w:rPr>
+              <w:t>08/05</w:t>
+              <w:br/>
+              <w:t>週三</w:t>
+            </w:r>
+          </w:p>
+        </w:tc>
+        <w:tc>
+          <w:tcPr>
+            <w:tcW w:type="dxa" w:w="3100"/>
+            <w:tcMar>
+              <w:top w:w="80" w:type="dxa"/>
+              <w:start w:w="120" w:type="dxa"/>
+              <w:bottom w:w="80" w:type="dxa"/>
+              <w:end w:w="120" w:type="dxa"/>
+            </w:tcMar>
+            <w:vAlign w:val="center"/>
+          </w:tcPr>
+          <w:p>
+            <w:pPr>
+              <w:spacing w:after="0"/>
+              <w:jc w:val="left"/>
+            </w:pPr>
+            <w:r>
+              <w:rPr>
+                <w:rFonts w:ascii="Calibri" w:hAnsi="Calibri" w:eastAsia="Microsoft JhengHei"/>
+                <w:b w:val="0"/>
+                <w:color w:val="000000"/>
+                <w:sz w:val="19"/>
+              </w:rPr>
+              <w:t>Swim: 甜甜課表</w:t>
+            </w:r>
+          </w:p>
+        </w:tc>
+        <w:tc>
+          <w:tcPr>
+            <w:tcW w:type="dxa" w:w="1100"/>
+            <w:tcMar>
+              <w:top w:w="80" w:type="dxa"/>
+              <w:start w:w="120" w:type="dxa"/>
+              <w:bottom w:w="80" w:type="dxa"/>
+              <w:end w:w="120" w:type="dxa"/>
+            </w:tcMar>
+            <w:vAlign w:val="center"/>
+          </w:tcPr>
+          <w:p>
+            <w:pPr>
+              <w:spacing w:after="0"/>
+              <w:jc w:val="center"/>
+            </w:pPr>
+            <w:r>
+              <w:rPr>
+                <w:rFonts w:ascii="Calibri" w:hAnsi="Calibri" w:eastAsia="Microsoft JhengHei"/>
+                <w:b w:val="0"/>
+                <w:color w:val="000000"/>
+                <w:sz w:val="19"/>
+              </w:rPr>
+              <w:t>Swim</w:t>
+            </w:r>
+          </w:p>
+        </w:tc>
+        <w:tc>
+          <w:tcPr>
+            <w:tcW w:type="dxa" w:w="1600"/>
+            <w:tcMar>
+              <w:top w:w="80" w:type="dxa"/>
+              <w:start w:w="120" w:type="dxa"/>
+              <w:bottom w:w="80" w:type="dxa"/>
+              <w:end w:w="120" w:type="dxa"/>
+            </w:tcMar>
+            <w:vAlign w:val="center"/>
+          </w:tcPr>
+          <w:p>
+            <w:pPr>
+              <w:spacing w:after="0"/>
+              <w:jc w:val="center"/>
+            </w:pPr>
+            <w:r>
+              <w:rPr>
+                <w:rFonts w:ascii="Calibri" w:hAnsi="Calibri" w:eastAsia="Microsoft JhengHei"/>
+                <w:b w:val="0"/>
+                <w:color w:val="000000"/>
+                <w:sz w:val="19"/>
+              </w:rPr>
+              <w:t>80分</w:t>
+            </w:r>
+          </w:p>
+        </w:tc>
+        <w:tc>
+          <w:tcPr>
+            <w:tcW w:type="dxa" w:w="1600"/>
+            <w:tcMar>
+              <w:top w:w="80" w:type="dxa"/>
+              <w:start w:w="120" w:type="dxa"/>
+              <w:bottom w:w="80" w:type="dxa"/>
+              <w:end w:w="120" w:type="dxa"/>
+            </w:tcMar>
+            <w:vAlign w:val="center"/>
+          </w:tcPr>
+          <w:p>
+            <w:pPr>
+              <w:spacing w:after="0"/>
+              <w:jc w:val="center"/>
+            </w:pPr>
+            <w:r>
+              <w:rPr>
+                <w:rFonts w:ascii="Calibri" w:hAnsi="Calibri" w:eastAsia="Microsoft JhengHei"/>
+                <w:b w:val="0"/>
+                <w:color w:val="000000"/>
+                <w:sz w:val="19"/>
+              </w:rPr>
+              <w:t>65分 / 3.30km</w:t>
+            </w:r>
+          </w:p>
+        </w:tc>
+        <w:tc>
+          <w:tcPr>
+            <w:tcW w:type="dxa" w:w="1160"/>
+            <w:tcMar>
+              <w:top w:w="80" w:type="dxa"/>
+              <w:start w:w="120" w:type="dxa"/>
+              <w:bottom w:w="80" w:type="dxa"/>
+              <w:end w:w="120" w:type="dxa"/>
+            </w:tcMar>
+            <w:vAlign w:val="center"/>
+          </w:tcPr>
+          <w:p>
+            <w:pPr>
+              <w:spacing w:after="0"/>
+              <w:jc w:val="center"/>
+            </w:pPr>
+            <w:r>
+              <w:rPr>
+                <w:rFonts w:ascii="Calibri" w:hAnsi="Calibri" w:eastAsia="Microsoft JhengHei"/>
+                <w:b w:val="0"/>
+                <w:color w:val="000000"/>
+                <w:sz w:val="19"/>
+              </w:rPr>
+              <w:t>✅ 已完成</w:t>
+            </w:r>
+          </w:p>
+        </w:tc>
+      </w:tr>
+      <w:tr>
+        <w:tc>
+          <w:tcPr>
+            <w:tcW w:type="dxa" w:w="1100"/>
+            <w:tcMar>
+              <w:top w:w="80" w:type="dxa"/>
+              <w:start w:w="120" w:type="dxa"/>
+              <w:bottom w:w="80" w:type="dxa"/>
+              <w:end w:w="120" w:type="dxa"/>
+            </w:tcMar>
+            <w:vAlign w:val="center"/>
+          </w:tcPr>
+          <w:p>
+            <w:pPr>
+              <w:spacing w:after="0"/>
+              <w:jc w:val="center"/>
+            </w:pPr>
+            <w:r>
+              <w:rPr>
+                <w:rFonts w:ascii="Calibri" w:hAnsi="Calibri" w:eastAsia="Microsoft JhengHei"/>
+                <w:b w:val="0"/>
+                <w:color w:val="000000"/>
+                <w:sz w:val="19"/>
+              </w:rPr>
               <w:t>08/06</w:t>
               <w:br/>
               <w:t>週四</w:t>
@@ -3458,6 +3624,504 @@
                 <w:sz w:val="19"/>
               </w:rPr>
               <w:t>29分 / 4.56km</w:t>
+            </w:r>
+          </w:p>
+        </w:tc>
+        <w:tc>
+          <w:tcPr>
+            <w:tcW w:type="dxa" w:w="1160"/>
+            <w:tcMar>
+              <w:top w:w="80" w:type="dxa"/>
+              <w:start w:w="120" w:type="dxa"/>
+              <w:bottom w:w="80" w:type="dxa"/>
+              <w:end w:w="120" w:type="dxa"/>
+            </w:tcMar>
+            <w:vAlign w:val="center"/>
+          </w:tcPr>
+          <w:p>
+            <w:pPr>
+              <w:spacing w:after="0"/>
+              <w:jc w:val="center"/>
+            </w:pPr>
+            <w:r>
+              <w:rPr>
+                <w:rFonts w:ascii="Calibri" w:hAnsi="Calibri" w:eastAsia="Microsoft JhengHei"/>
+                <w:b w:val="0"/>
+                <w:color w:val="000000"/>
+                <w:sz w:val="19"/>
+              </w:rPr>
+              <w:t>✅ 已完成</w:t>
+            </w:r>
+          </w:p>
+        </w:tc>
+      </w:tr>
+      <w:tr>
+        <w:tc>
+          <w:tcPr>
+            <w:tcW w:type="dxa" w:w="1100"/>
+            <w:tcMar>
+              <w:top w:w="80" w:type="dxa"/>
+              <w:start w:w="120" w:type="dxa"/>
+              <w:bottom w:w="80" w:type="dxa"/>
+              <w:end w:w="120" w:type="dxa"/>
+            </w:tcMar>
+            <w:vAlign w:val="center"/>
+          </w:tcPr>
+          <w:p>
+            <w:pPr>
+              <w:spacing w:after="0"/>
+              <w:jc w:val="center"/>
+            </w:pPr>
+            <w:r>
+              <w:rPr>
+                <w:rFonts w:ascii="Calibri" w:hAnsi="Calibri" w:eastAsia="Microsoft JhengHei"/>
+                <w:b w:val="0"/>
+                <w:color w:val="000000"/>
+                <w:sz w:val="19"/>
+              </w:rPr>
+              <w:t>08/06</w:t>
+              <w:br/>
+              <w:t>週四</w:t>
+            </w:r>
+          </w:p>
+        </w:tc>
+        <w:tc>
+          <w:tcPr>
+            <w:tcW w:type="dxa" w:w="3100"/>
+            <w:tcMar>
+              <w:top w:w="80" w:type="dxa"/>
+              <w:start w:w="120" w:type="dxa"/>
+              <w:bottom w:w="80" w:type="dxa"/>
+              <w:end w:w="120" w:type="dxa"/>
+            </w:tcMar>
+            <w:vAlign w:val="center"/>
+          </w:tcPr>
+          <w:p>
+            <w:pPr>
+              <w:spacing w:after="0"/>
+              <w:jc w:val="left"/>
+            </w:pPr>
+            <w:r>
+              <w:rPr>
+                <w:rFonts w:ascii="Calibri" w:hAnsi="Calibri" w:eastAsia="Microsoft JhengHei"/>
+                <w:b w:val="0"/>
+                <w:color w:val="000000"/>
+                <w:sz w:val="19"/>
+              </w:rPr>
+              <w:t>Bike: TEMPO 9'30 X 8</w:t>
+            </w:r>
+          </w:p>
+        </w:tc>
+        <w:tc>
+          <w:tcPr>
+            <w:tcW w:type="dxa" w:w="1100"/>
+            <w:tcMar>
+              <w:top w:w="80" w:type="dxa"/>
+              <w:start w:w="120" w:type="dxa"/>
+              <w:bottom w:w="80" w:type="dxa"/>
+              <w:end w:w="120" w:type="dxa"/>
+            </w:tcMar>
+            <w:vAlign w:val="center"/>
+          </w:tcPr>
+          <w:p>
+            <w:pPr>
+              <w:spacing w:after="0"/>
+              <w:jc w:val="center"/>
+            </w:pPr>
+            <w:r>
+              <w:rPr>
+                <w:rFonts w:ascii="Calibri" w:hAnsi="Calibri" w:eastAsia="Microsoft JhengHei"/>
+                <w:b w:val="0"/>
+                <w:color w:val="000000"/>
+                <w:sz w:val="19"/>
+              </w:rPr>
+              <w:t>Bike</w:t>
+            </w:r>
+          </w:p>
+        </w:tc>
+        <w:tc>
+          <w:tcPr>
+            <w:tcW w:type="dxa" w:w="1600"/>
+            <w:tcMar>
+              <w:top w:w="80" w:type="dxa"/>
+              <w:start w:w="120" w:type="dxa"/>
+              <w:bottom w:w="80" w:type="dxa"/>
+              <w:end w:w="120" w:type="dxa"/>
+            </w:tcMar>
+            <w:vAlign w:val="center"/>
+          </w:tcPr>
+          <w:p>
+            <w:pPr>
+              <w:spacing w:after="0"/>
+              <w:jc w:val="center"/>
+            </w:pPr>
+            <w:r>
+              <w:rPr>
+                <w:rFonts w:ascii="Calibri" w:hAnsi="Calibri" w:eastAsia="Microsoft JhengHei"/>
+                <w:b w:val="0"/>
+                <w:color w:val="000000"/>
+                <w:sz w:val="19"/>
+              </w:rPr>
+              <w:t>90分</w:t>
+            </w:r>
+          </w:p>
+        </w:tc>
+        <w:tc>
+          <w:tcPr>
+            <w:tcW w:type="dxa" w:w="1600"/>
+            <w:tcMar>
+              <w:top w:w="80" w:type="dxa"/>
+              <w:start w:w="120" w:type="dxa"/>
+              <w:bottom w:w="80" w:type="dxa"/>
+              <w:end w:w="120" w:type="dxa"/>
+            </w:tcMar>
+            <w:vAlign w:val="center"/>
+          </w:tcPr>
+          <w:p>
+            <w:pPr>
+              <w:spacing w:after="0"/>
+              <w:jc w:val="center"/>
+            </w:pPr>
+            <w:r>
+              <w:rPr>
+                <w:rFonts w:ascii="Calibri" w:hAnsi="Calibri" w:eastAsia="Microsoft JhengHei"/>
+                <w:b w:val="0"/>
+                <w:color w:val="000000"/>
+                <w:sz w:val="19"/>
+              </w:rPr>
+              <w:t>196分 / 59.67km</w:t>
+            </w:r>
+          </w:p>
+        </w:tc>
+        <w:tc>
+          <w:tcPr>
+            <w:tcW w:type="dxa" w:w="1160"/>
+            <w:tcMar>
+              <w:top w:w="80" w:type="dxa"/>
+              <w:start w:w="120" w:type="dxa"/>
+              <w:bottom w:w="80" w:type="dxa"/>
+              <w:end w:w="120" w:type="dxa"/>
+            </w:tcMar>
+            <w:vAlign w:val="center"/>
+          </w:tcPr>
+          <w:p>
+            <w:pPr>
+              <w:spacing w:after="0"/>
+              <w:jc w:val="center"/>
+            </w:pPr>
+            <w:r>
+              <w:rPr>
+                <w:rFonts w:ascii="Calibri" w:hAnsi="Calibri" w:eastAsia="Microsoft JhengHei"/>
+                <w:b w:val="0"/>
+                <w:color w:val="000000"/>
+                <w:sz w:val="19"/>
+              </w:rPr>
+              <w:t>✅ 已完成</w:t>
+            </w:r>
+          </w:p>
+        </w:tc>
+      </w:tr>
+      <w:tr>
+        <w:tc>
+          <w:tcPr>
+            <w:tcW w:type="dxa" w:w="1100"/>
+            <w:tcMar>
+              <w:top w:w="80" w:type="dxa"/>
+              <w:start w:w="120" w:type="dxa"/>
+              <w:bottom w:w="80" w:type="dxa"/>
+              <w:end w:w="120" w:type="dxa"/>
+            </w:tcMar>
+            <w:vAlign w:val="center"/>
+          </w:tcPr>
+          <w:p>
+            <w:pPr>
+              <w:spacing w:after="0"/>
+              <w:jc w:val="center"/>
+            </w:pPr>
+            <w:r>
+              <w:rPr>
+                <w:rFonts w:ascii="Calibri" w:hAnsi="Calibri" w:eastAsia="Microsoft JhengHei"/>
+                <w:b w:val="0"/>
+                <w:color w:val="000000"/>
+                <w:sz w:val="19"/>
+              </w:rPr>
+              <w:t>08/06</w:t>
+              <w:br/>
+              <w:t>週四</w:t>
+            </w:r>
+          </w:p>
+        </w:tc>
+        <w:tc>
+          <w:tcPr>
+            <w:tcW w:type="dxa" w:w="3100"/>
+            <w:tcMar>
+              <w:top w:w="80" w:type="dxa"/>
+              <w:start w:w="120" w:type="dxa"/>
+              <w:bottom w:w="80" w:type="dxa"/>
+              <w:end w:w="120" w:type="dxa"/>
+            </w:tcMar>
+            <w:vAlign w:val="center"/>
+          </w:tcPr>
+          <w:p>
+            <w:pPr>
+              <w:spacing w:after="0"/>
+              <w:jc w:val="left"/>
+            </w:pPr>
+            <w:r>
+              <w:rPr>
+                <w:rFonts w:ascii="Calibri" w:hAnsi="Calibri" w:eastAsia="Microsoft JhengHei"/>
+                <w:b w:val="0"/>
+                <w:color w:val="000000"/>
+                <w:sz w:val="19"/>
+              </w:rPr>
+              <w:t>Run: 轉換30分</w:t>
+            </w:r>
+          </w:p>
+        </w:tc>
+        <w:tc>
+          <w:tcPr>
+            <w:tcW w:type="dxa" w:w="1100"/>
+            <w:tcMar>
+              <w:top w:w="80" w:type="dxa"/>
+              <w:start w:w="120" w:type="dxa"/>
+              <w:bottom w:w="80" w:type="dxa"/>
+              <w:end w:w="120" w:type="dxa"/>
+            </w:tcMar>
+            <w:vAlign w:val="center"/>
+          </w:tcPr>
+          <w:p>
+            <w:pPr>
+              <w:spacing w:after="0"/>
+              <w:jc w:val="center"/>
+            </w:pPr>
+            <w:r>
+              <w:rPr>
+                <w:rFonts w:ascii="Calibri" w:hAnsi="Calibri" w:eastAsia="Microsoft JhengHei"/>
+                <w:b w:val="0"/>
+                <w:color w:val="000000"/>
+                <w:sz w:val="19"/>
+              </w:rPr>
+              <w:t>Run</w:t>
+            </w:r>
+          </w:p>
+        </w:tc>
+        <w:tc>
+          <w:tcPr>
+            <w:tcW w:type="dxa" w:w="1600"/>
+            <w:tcMar>
+              <w:top w:w="80" w:type="dxa"/>
+              <w:start w:w="120" w:type="dxa"/>
+              <w:bottom w:w="80" w:type="dxa"/>
+              <w:end w:w="120" w:type="dxa"/>
+            </w:tcMar>
+            <w:vAlign w:val="center"/>
+          </w:tcPr>
+          <w:p>
+            <w:pPr>
+              <w:spacing w:after="0"/>
+              <w:jc w:val="center"/>
+            </w:pPr>
+            <w:r>
+              <w:rPr>
+                <w:rFonts w:ascii="Calibri" w:hAnsi="Calibri" w:eastAsia="Microsoft JhengHei"/>
+                <w:b w:val="0"/>
+                <w:color w:val="000000"/>
+                <w:sz w:val="19"/>
+              </w:rPr>
+              <w:t>30分 / 5.00km</w:t>
+            </w:r>
+          </w:p>
+        </w:tc>
+        <w:tc>
+          <w:tcPr>
+            <w:tcW w:type="dxa" w:w="1600"/>
+            <w:tcMar>
+              <w:top w:w="80" w:type="dxa"/>
+              <w:start w:w="120" w:type="dxa"/>
+              <w:bottom w:w="80" w:type="dxa"/>
+              <w:end w:w="120" w:type="dxa"/>
+            </w:tcMar>
+            <w:vAlign w:val="center"/>
+          </w:tcPr>
+          <w:p>
+            <w:pPr>
+              <w:spacing w:after="0"/>
+              <w:jc w:val="center"/>
+            </w:pPr>
+            <w:r>
+              <w:rPr>
+                <w:rFonts w:ascii="Calibri" w:hAnsi="Calibri" w:eastAsia="Microsoft JhengHei"/>
+                <w:b w:val="0"/>
+                <w:color w:val="000000"/>
+                <w:sz w:val="19"/>
+              </w:rPr>
+              <w:t>29分 / 4.56km</w:t>
+            </w:r>
+          </w:p>
+        </w:tc>
+        <w:tc>
+          <w:tcPr>
+            <w:tcW w:type="dxa" w:w="1160"/>
+            <w:tcMar>
+              <w:top w:w="80" w:type="dxa"/>
+              <w:start w:w="120" w:type="dxa"/>
+              <w:bottom w:w="80" w:type="dxa"/>
+              <w:end w:w="120" w:type="dxa"/>
+            </w:tcMar>
+            <w:vAlign w:val="center"/>
+          </w:tcPr>
+          <w:p>
+            <w:pPr>
+              <w:spacing w:after="0"/>
+              <w:jc w:val="center"/>
+            </w:pPr>
+            <w:r>
+              <w:rPr>
+                <w:rFonts w:ascii="Calibri" w:hAnsi="Calibri" w:eastAsia="Microsoft JhengHei"/>
+                <w:b w:val="0"/>
+                <w:color w:val="000000"/>
+                <w:sz w:val="19"/>
+              </w:rPr>
+              <w:t>✅ 已完成</w:t>
+            </w:r>
+          </w:p>
+        </w:tc>
+      </w:tr>
+      <w:tr>
+        <w:tc>
+          <w:tcPr>
+            <w:tcW w:type="dxa" w:w="1100"/>
+            <w:tcMar>
+              <w:top w:w="80" w:type="dxa"/>
+              <w:start w:w="120" w:type="dxa"/>
+              <w:bottom w:w="80" w:type="dxa"/>
+              <w:end w:w="120" w:type="dxa"/>
+            </w:tcMar>
+            <w:vAlign w:val="center"/>
+          </w:tcPr>
+          <w:p>
+            <w:pPr>
+              <w:spacing w:after="0"/>
+              <w:jc w:val="center"/>
+            </w:pPr>
+            <w:r>
+              <w:rPr>
+                <w:rFonts w:ascii="Calibri" w:hAnsi="Calibri" w:eastAsia="Microsoft JhengHei"/>
+                <w:b w:val="0"/>
+                <w:color w:val="000000"/>
+                <w:sz w:val="19"/>
+              </w:rPr>
+              <w:t>08/07</w:t>
+              <w:br/>
+              <w:t>週五</w:t>
+            </w:r>
+          </w:p>
+        </w:tc>
+        <w:tc>
+          <w:tcPr>
+            <w:tcW w:type="dxa" w:w="3100"/>
+            <w:tcMar>
+              <w:top w:w="80" w:type="dxa"/>
+              <w:start w:w="120" w:type="dxa"/>
+              <w:bottom w:w="80" w:type="dxa"/>
+              <w:end w:w="120" w:type="dxa"/>
+            </w:tcMar>
+            <w:vAlign w:val="center"/>
+          </w:tcPr>
+          <w:p>
+            <w:pPr>
+              <w:spacing w:after="0"/>
+              <w:jc w:val="left"/>
+            </w:pPr>
+            <w:r>
+              <w:rPr>
+                <w:rFonts w:ascii="Calibri" w:hAnsi="Calibri" w:eastAsia="Microsoft JhengHei"/>
+                <w:b w:val="0"/>
+                <w:color w:val="000000"/>
+                <w:sz w:val="19"/>
+              </w:rPr>
+              <w:t>Swim: 甜甜課表</w:t>
+            </w:r>
+          </w:p>
+        </w:tc>
+        <w:tc>
+          <w:tcPr>
+            <w:tcW w:type="dxa" w:w="1100"/>
+            <w:tcMar>
+              <w:top w:w="80" w:type="dxa"/>
+              <w:start w:w="120" w:type="dxa"/>
+              <w:bottom w:w="80" w:type="dxa"/>
+              <w:end w:w="120" w:type="dxa"/>
+            </w:tcMar>
+            <w:vAlign w:val="center"/>
+          </w:tcPr>
+          <w:p>
+            <w:pPr>
+              <w:spacing w:after="0"/>
+              <w:jc w:val="center"/>
+            </w:pPr>
+            <w:r>
+              <w:rPr>
+                <w:rFonts w:ascii="Calibri" w:hAnsi="Calibri" w:eastAsia="Microsoft JhengHei"/>
+                <w:b w:val="0"/>
+                <w:color w:val="000000"/>
+                <w:sz w:val="19"/>
+              </w:rPr>
+              <w:t>Swim</w:t>
+            </w:r>
+          </w:p>
+        </w:tc>
+        <w:tc>
+          <w:tcPr>
+            <w:tcW w:type="dxa" w:w="1600"/>
+            <w:tcMar>
+              <w:top w:w="80" w:type="dxa"/>
+              <w:start w:w="120" w:type="dxa"/>
+              <w:bottom w:w="80" w:type="dxa"/>
+              <w:end w:w="120" w:type="dxa"/>
+            </w:tcMar>
+            <w:vAlign w:val="center"/>
+          </w:tcPr>
+          <w:p>
+            <w:pPr>
+              <w:spacing w:after="0"/>
+              <w:jc w:val="center"/>
+            </w:pPr>
+            <w:r>
+              <w:rPr>
+                <w:rFonts w:ascii="Calibri" w:hAnsi="Calibri" w:eastAsia="Microsoft JhengHei"/>
+                <w:b w:val="0"/>
+                <w:color w:val="000000"/>
+                <w:sz w:val="19"/>
+              </w:rPr>
+              <w:t>80分</w:t>
+            </w:r>
+          </w:p>
+        </w:tc>
+        <w:tc>
+          <w:tcPr>
+            <w:tcW w:type="dxa" w:w="1600"/>
+            <w:tcMar>
+              <w:top w:w="80" w:type="dxa"/>
+              <w:start w:w="120" w:type="dxa"/>
+              <w:bottom w:w="80" w:type="dxa"/>
+              <w:end w:w="120" w:type="dxa"/>
+            </w:tcMar>
+            <w:vAlign w:val="center"/>
+          </w:tcPr>
+          <w:p>
+            <w:pPr>
+              <w:spacing w:after="0"/>
+              <w:jc w:val="center"/>
+            </w:pPr>
+            <w:r>
+              <w:rPr>
+                <w:rFonts w:ascii="Calibri" w:hAnsi="Calibri" w:eastAsia="Microsoft JhengHei"/>
+                <w:b w:val="0"/>
+                <w:color w:val="000000"/>
+                <w:sz w:val="19"/>
+              </w:rPr>
+              <w:t>67分 / 3.40km</w:t>
             </w:r>
           </w:p>
         </w:tc>
@@ -4841,6 +5505,670 @@
                 <w:color w:val="000000"/>
                 <w:sz w:val="19"/>
               </w:rPr>
+              <w:t>08/08</w:t>
+              <w:br/>
+              <w:t>週六</w:t>
+            </w:r>
+          </w:p>
+        </w:tc>
+        <w:tc>
+          <w:tcPr>
+            <w:tcW w:type="dxa" w:w="3100"/>
+            <w:tcMar>
+              <w:top w:w="80" w:type="dxa"/>
+              <w:start w:w="120" w:type="dxa"/>
+              <w:bottom w:w="80" w:type="dxa"/>
+              <w:end w:w="120" w:type="dxa"/>
+            </w:tcMar>
+            <w:vAlign w:val="center"/>
+          </w:tcPr>
+          <w:p>
+            <w:pPr>
+              <w:spacing w:after="0"/>
+              <w:jc w:val="left"/>
+            </w:pPr>
+            <w:r>
+              <w:rPr>
+                <w:rFonts w:ascii="Calibri" w:hAnsi="Calibri" w:eastAsia="Microsoft JhengHei"/>
+                <w:b w:val="0"/>
+                <w:color w:val="000000"/>
+                <w:sz w:val="19"/>
+              </w:rPr>
+              <w:t>Bike: 3</w:t>
+            </w:r>
+          </w:p>
+        </w:tc>
+        <w:tc>
+          <w:tcPr>
+            <w:tcW w:type="dxa" w:w="1100"/>
+            <w:tcMar>
+              <w:top w:w="80" w:type="dxa"/>
+              <w:start w:w="120" w:type="dxa"/>
+              <w:bottom w:w="80" w:type="dxa"/>
+              <w:end w:w="120" w:type="dxa"/>
+            </w:tcMar>
+            <w:vAlign w:val="center"/>
+          </w:tcPr>
+          <w:p>
+            <w:pPr>
+              <w:spacing w:after="0"/>
+              <w:jc w:val="center"/>
+            </w:pPr>
+            <w:r>
+              <w:rPr>
+                <w:rFonts w:ascii="Calibri" w:hAnsi="Calibri" w:eastAsia="Microsoft JhengHei"/>
+                <w:b w:val="0"/>
+                <w:color w:val="000000"/>
+                <w:sz w:val="19"/>
+              </w:rPr>
+              <w:t>Bike</w:t>
+            </w:r>
+          </w:p>
+        </w:tc>
+        <w:tc>
+          <w:tcPr>
+            <w:tcW w:type="dxa" w:w="1600"/>
+            <w:tcMar>
+              <w:top w:w="80" w:type="dxa"/>
+              <w:start w:w="120" w:type="dxa"/>
+              <w:bottom w:w="80" w:type="dxa"/>
+              <w:end w:w="120" w:type="dxa"/>
+            </w:tcMar>
+            <w:vAlign w:val="center"/>
+          </w:tcPr>
+          <w:p>
+            <w:pPr>
+              <w:spacing w:after="0"/>
+              <w:jc w:val="center"/>
+            </w:pPr>
+            <w:r>
+              <w:rPr>
+                <w:rFonts w:ascii="Calibri" w:hAnsi="Calibri" w:eastAsia="Microsoft JhengHei"/>
+                <w:b w:val="0"/>
+                <w:color w:val="000000"/>
+                <w:sz w:val="19"/>
+              </w:rPr>
+              <w:t>180分</w:t>
+            </w:r>
+          </w:p>
+        </w:tc>
+        <w:tc>
+          <w:tcPr>
+            <w:tcW w:type="dxa" w:w="1600"/>
+            <w:tcMar>
+              <w:top w:w="80" w:type="dxa"/>
+              <w:start w:w="120" w:type="dxa"/>
+              <w:bottom w:w="80" w:type="dxa"/>
+              <w:end w:w="120" w:type="dxa"/>
+            </w:tcMar>
+            <w:vAlign w:val="center"/>
+          </w:tcPr>
+          <w:p>
+            <w:pPr>
+              <w:spacing w:after="0"/>
+              <w:jc w:val="center"/>
+            </w:pPr>
+            <w:r>
+              <w:rPr>
+                <w:rFonts w:ascii="Calibri" w:hAnsi="Calibri" w:eastAsia="Microsoft JhengHei"/>
+                <w:b w:val="0"/>
+                <w:color w:val="000000"/>
+                <w:sz w:val="19"/>
+              </w:rPr>
+              <w:t>180分 / 90.84km</w:t>
+            </w:r>
+          </w:p>
+        </w:tc>
+        <w:tc>
+          <w:tcPr>
+            <w:tcW w:type="dxa" w:w="1160"/>
+            <w:tcMar>
+              <w:top w:w="80" w:type="dxa"/>
+              <w:start w:w="120" w:type="dxa"/>
+              <w:bottom w:w="80" w:type="dxa"/>
+              <w:end w:w="120" w:type="dxa"/>
+            </w:tcMar>
+            <w:vAlign w:val="center"/>
+          </w:tcPr>
+          <w:p>
+            <w:pPr>
+              <w:spacing w:after="0"/>
+              <w:jc w:val="center"/>
+            </w:pPr>
+            <w:r>
+              <w:rPr>
+                <w:rFonts w:ascii="Calibri" w:hAnsi="Calibri" w:eastAsia="Microsoft JhengHei"/>
+                <w:b w:val="0"/>
+                <w:color w:val="000000"/>
+                <w:sz w:val="19"/>
+              </w:rPr>
+              <w:t>✅ 已完成</w:t>
+            </w:r>
+          </w:p>
+        </w:tc>
+      </w:tr>
+      <w:tr>
+        <w:tc>
+          <w:tcPr>
+            <w:tcW w:type="dxa" w:w="1100"/>
+            <w:tcMar>
+              <w:top w:w="80" w:type="dxa"/>
+              <w:start w:w="120" w:type="dxa"/>
+              <w:bottom w:w="80" w:type="dxa"/>
+              <w:end w:w="120" w:type="dxa"/>
+            </w:tcMar>
+            <w:vAlign w:val="center"/>
+          </w:tcPr>
+          <w:p>
+            <w:pPr>
+              <w:spacing w:after="0"/>
+              <w:jc w:val="center"/>
+            </w:pPr>
+            <w:r>
+              <w:rPr>
+                <w:rFonts w:ascii="Calibri" w:hAnsi="Calibri" w:eastAsia="Microsoft JhengHei"/>
+                <w:b w:val="0"/>
+                <w:color w:val="000000"/>
+                <w:sz w:val="19"/>
+              </w:rPr>
+              <w:t>08/08</w:t>
+              <w:br/>
+              <w:t>週六</w:t>
+            </w:r>
+          </w:p>
+        </w:tc>
+        <w:tc>
+          <w:tcPr>
+            <w:tcW w:type="dxa" w:w="3100"/>
+            <w:tcMar>
+              <w:top w:w="80" w:type="dxa"/>
+              <w:start w:w="120" w:type="dxa"/>
+              <w:bottom w:w="80" w:type="dxa"/>
+              <w:end w:w="120" w:type="dxa"/>
+            </w:tcMar>
+            <w:vAlign w:val="center"/>
+          </w:tcPr>
+          <w:p>
+            <w:pPr>
+              <w:spacing w:after="0"/>
+              <w:jc w:val="left"/>
+            </w:pPr>
+            <w:r>
+              <w:rPr>
+                <w:rFonts w:ascii="Calibri" w:hAnsi="Calibri" w:eastAsia="Microsoft JhengHei"/>
+                <w:b w:val="0"/>
+                <w:color w:val="000000"/>
+                <w:sz w:val="19"/>
+              </w:rPr>
+              <w:t>Run: Running</w:t>
+            </w:r>
+          </w:p>
+        </w:tc>
+        <w:tc>
+          <w:tcPr>
+            <w:tcW w:type="dxa" w:w="1100"/>
+            <w:tcMar>
+              <w:top w:w="80" w:type="dxa"/>
+              <w:start w:w="120" w:type="dxa"/>
+              <w:bottom w:w="80" w:type="dxa"/>
+              <w:end w:w="120" w:type="dxa"/>
+            </w:tcMar>
+            <w:vAlign w:val="center"/>
+          </w:tcPr>
+          <w:p>
+            <w:pPr>
+              <w:spacing w:after="0"/>
+              <w:jc w:val="center"/>
+            </w:pPr>
+            <w:r>
+              <w:rPr>
+                <w:rFonts w:ascii="Calibri" w:hAnsi="Calibri" w:eastAsia="Microsoft JhengHei"/>
+                <w:b w:val="0"/>
+                <w:color w:val="000000"/>
+                <w:sz w:val="19"/>
+              </w:rPr>
+              <w:t>Run</w:t>
+            </w:r>
+          </w:p>
+        </w:tc>
+        <w:tc>
+          <w:tcPr>
+            <w:tcW w:type="dxa" w:w="1600"/>
+            <w:tcMar>
+              <w:top w:w="80" w:type="dxa"/>
+              <w:start w:w="120" w:type="dxa"/>
+              <w:bottom w:w="80" w:type="dxa"/>
+              <w:end w:w="120" w:type="dxa"/>
+            </w:tcMar>
+            <w:vAlign w:val="center"/>
+          </w:tcPr>
+          <w:p>
+            <w:pPr>
+              <w:spacing w:after="0"/>
+              <w:jc w:val="center"/>
+            </w:pPr>
+            <w:r>
+              <w:rPr>
+                <w:rFonts w:ascii="Calibri" w:hAnsi="Calibri" w:eastAsia="Microsoft JhengHei"/>
+                <w:b w:val="0"/>
+                <w:color w:val="000000"/>
+                <w:sz w:val="19"/>
+              </w:rPr>
+              <w:t>75分 / 12.00km</w:t>
+            </w:r>
+          </w:p>
+        </w:tc>
+        <w:tc>
+          <w:tcPr>
+            <w:tcW w:type="dxa" w:w="1600"/>
+            <w:tcMar>
+              <w:top w:w="80" w:type="dxa"/>
+              <w:start w:w="120" w:type="dxa"/>
+              <w:bottom w:w="80" w:type="dxa"/>
+              <w:end w:w="120" w:type="dxa"/>
+            </w:tcMar>
+            <w:vAlign w:val="center"/>
+          </w:tcPr>
+          <w:p>
+            <w:pPr>
+              <w:spacing w:after="0"/>
+              <w:jc w:val="center"/>
+            </w:pPr>
+            <w:r>
+              <w:rPr>
+                <w:rFonts w:ascii="Calibri" w:hAnsi="Calibri" w:eastAsia="Microsoft JhengHei"/>
+                <w:b w:val="0"/>
+                <w:color w:val="000000"/>
+                <w:sz w:val="19"/>
+              </w:rPr>
+              <w:t>44分 / 6.82km</w:t>
+            </w:r>
+          </w:p>
+        </w:tc>
+        <w:tc>
+          <w:tcPr>
+            <w:tcW w:type="dxa" w:w="1160"/>
+            <w:tcMar>
+              <w:top w:w="80" w:type="dxa"/>
+              <w:start w:w="120" w:type="dxa"/>
+              <w:bottom w:w="80" w:type="dxa"/>
+              <w:end w:w="120" w:type="dxa"/>
+            </w:tcMar>
+            <w:vAlign w:val="center"/>
+          </w:tcPr>
+          <w:p>
+            <w:pPr>
+              <w:spacing w:after="0"/>
+              <w:jc w:val="center"/>
+            </w:pPr>
+            <w:r>
+              <w:rPr>
+                <w:rFonts w:ascii="Calibri" w:hAnsi="Calibri" w:eastAsia="Microsoft JhengHei"/>
+                <w:b w:val="0"/>
+                <w:color w:val="000000"/>
+                <w:sz w:val="19"/>
+              </w:rPr>
+              <w:t>✅ 已完成</w:t>
+            </w:r>
+          </w:p>
+        </w:tc>
+      </w:tr>
+      <w:tr>
+        <w:tc>
+          <w:tcPr>
+            <w:tcW w:type="dxa" w:w="1100"/>
+            <w:tcMar>
+              <w:top w:w="80" w:type="dxa"/>
+              <w:start w:w="120" w:type="dxa"/>
+              <w:bottom w:w="80" w:type="dxa"/>
+              <w:end w:w="120" w:type="dxa"/>
+            </w:tcMar>
+            <w:vAlign w:val="center"/>
+          </w:tcPr>
+          <w:p>
+            <w:pPr>
+              <w:spacing w:after="0"/>
+              <w:jc w:val="center"/>
+            </w:pPr>
+            <w:r>
+              <w:rPr>
+                <w:rFonts w:ascii="Calibri" w:hAnsi="Calibri" w:eastAsia="Microsoft JhengHei"/>
+                <w:b w:val="0"/>
+                <w:color w:val="000000"/>
+                <w:sz w:val="19"/>
+              </w:rPr>
+              <w:t>08/08</w:t>
+              <w:br/>
+              <w:t>週六</w:t>
+            </w:r>
+          </w:p>
+        </w:tc>
+        <w:tc>
+          <w:tcPr>
+            <w:tcW w:type="dxa" w:w="3100"/>
+            <w:tcMar>
+              <w:top w:w="80" w:type="dxa"/>
+              <w:start w:w="120" w:type="dxa"/>
+              <w:bottom w:w="80" w:type="dxa"/>
+              <w:end w:w="120" w:type="dxa"/>
+            </w:tcMar>
+            <w:vAlign w:val="center"/>
+          </w:tcPr>
+          <w:p>
+            <w:pPr>
+              <w:spacing w:after="0"/>
+              <w:jc w:val="left"/>
+            </w:pPr>
+            <w:r>
+              <w:rPr>
+                <w:rFonts w:ascii="Calibri" w:hAnsi="Calibri" w:eastAsia="Microsoft JhengHei"/>
+                <w:b w:val="0"/>
+                <w:color w:val="000000"/>
+                <w:sz w:val="19"/>
+              </w:rPr>
+              <w:t>Walk: Walking</w:t>
+            </w:r>
+          </w:p>
+        </w:tc>
+        <w:tc>
+          <w:tcPr>
+            <w:tcW w:type="dxa" w:w="1100"/>
+            <w:tcMar>
+              <w:top w:w="80" w:type="dxa"/>
+              <w:start w:w="120" w:type="dxa"/>
+              <w:bottom w:w="80" w:type="dxa"/>
+              <w:end w:w="120" w:type="dxa"/>
+            </w:tcMar>
+            <w:vAlign w:val="center"/>
+          </w:tcPr>
+          <w:p>
+            <w:pPr>
+              <w:spacing w:after="0"/>
+              <w:jc w:val="center"/>
+            </w:pPr>
+            <w:r>
+              <w:rPr>
+                <w:rFonts w:ascii="Calibri" w:hAnsi="Calibri" w:eastAsia="Microsoft JhengHei"/>
+                <w:b w:val="0"/>
+                <w:color w:val="000000"/>
+                <w:sz w:val="19"/>
+              </w:rPr>
+              <w:t>Other</w:t>
+            </w:r>
+          </w:p>
+        </w:tc>
+        <w:tc>
+          <w:tcPr>
+            <w:tcW w:type="dxa" w:w="1600"/>
+            <w:tcMar>
+              <w:top w:w="80" w:type="dxa"/>
+              <w:start w:w="120" w:type="dxa"/>
+              <w:bottom w:w="80" w:type="dxa"/>
+              <w:end w:w="120" w:type="dxa"/>
+            </w:tcMar>
+            <w:vAlign w:val="center"/>
+          </w:tcPr>
+          <w:p>
+            <w:pPr>
+              <w:spacing w:after="0"/>
+              <w:jc w:val="center"/>
+            </w:pPr>
+            <w:r>
+              <w:rPr>
+                <w:rFonts w:ascii="Calibri" w:hAnsi="Calibri" w:eastAsia="Microsoft JhengHei"/>
+                <w:b w:val="0"/>
+                <w:color w:val="000000"/>
+                <w:sz w:val="19"/>
+              </w:rPr>
+              <w:t>0分</w:t>
+            </w:r>
+          </w:p>
+        </w:tc>
+        <w:tc>
+          <w:tcPr>
+            <w:tcW w:type="dxa" w:w="1600"/>
+            <w:tcMar>
+              <w:top w:w="80" w:type="dxa"/>
+              <w:start w:w="120" w:type="dxa"/>
+              <w:bottom w:w="80" w:type="dxa"/>
+              <w:end w:w="120" w:type="dxa"/>
+            </w:tcMar>
+            <w:vAlign w:val="center"/>
+          </w:tcPr>
+          <w:p>
+            <w:pPr>
+              <w:spacing w:after="0"/>
+              <w:jc w:val="center"/>
+            </w:pPr>
+            <w:r>
+              <w:rPr>
+                <w:rFonts w:ascii="Calibri" w:hAnsi="Calibri" w:eastAsia="Microsoft JhengHei"/>
+                <w:b w:val="0"/>
+                <w:color w:val="000000"/>
+                <w:sz w:val="19"/>
+              </w:rPr>
+              <w:t>5分 / 0.36km</w:t>
+            </w:r>
+          </w:p>
+        </w:tc>
+        <w:tc>
+          <w:tcPr>
+            <w:tcW w:type="dxa" w:w="1160"/>
+            <w:tcMar>
+              <w:top w:w="80" w:type="dxa"/>
+              <w:start w:w="120" w:type="dxa"/>
+              <w:bottom w:w="80" w:type="dxa"/>
+              <w:end w:w="120" w:type="dxa"/>
+            </w:tcMar>
+            <w:vAlign w:val="center"/>
+          </w:tcPr>
+          <w:p>
+            <w:pPr>
+              <w:spacing w:after="0"/>
+              <w:jc w:val="center"/>
+            </w:pPr>
+            <w:r>
+              <w:rPr>
+                <w:rFonts w:ascii="Calibri" w:hAnsi="Calibri" w:eastAsia="Microsoft JhengHei"/>
+                <w:b w:val="0"/>
+                <w:color w:val="000000"/>
+                <w:sz w:val="19"/>
+              </w:rPr>
+              <w:t>✅ 已完成</w:t>
+            </w:r>
+          </w:p>
+        </w:tc>
+      </w:tr>
+      <w:tr>
+        <w:tc>
+          <w:tcPr>
+            <w:tcW w:type="dxa" w:w="1100"/>
+            <w:tcMar>
+              <w:top w:w="80" w:type="dxa"/>
+              <w:start w:w="120" w:type="dxa"/>
+              <w:bottom w:w="80" w:type="dxa"/>
+              <w:end w:w="120" w:type="dxa"/>
+            </w:tcMar>
+            <w:vAlign w:val="center"/>
+          </w:tcPr>
+          <w:p>
+            <w:pPr>
+              <w:spacing w:after="0"/>
+              <w:jc w:val="center"/>
+            </w:pPr>
+            <w:r>
+              <w:rPr>
+                <w:rFonts w:ascii="Calibri" w:hAnsi="Calibri" w:eastAsia="Microsoft JhengHei"/>
+                <w:b w:val="0"/>
+                <w:color w:val="000000"/>
+                <w:sz w:val="19"/>
+              </w:rPr>
+              <w:t>08/09</w:t>
+              <w:br/>
+              <w:t>週日</w:t>
+            </w:r>
+          </w:p>
+        </w:tc>
+        <w:tc>
+          <w:tcPr>
+            <w:tcW w:type="dxa" w:w="3100"/>
+            <w:tcMar>
+              <w:top w:w="80" w:type="dxa"/>
+              <w:start w:w="120" w:type="dxa"/>
+              <w:bottom w:w="80" w:type="dxa"/>
+              <w:end w:w="120" w:type="dxa"/>
+            </w:tcMar>
+            <w:vAlign w:val="center"/>
+          </w:tcPr>
+          <w:p>
+            <w:pPr>
+              <w:spacing w:after="0"/>
+              <w:jc w:val="left"/>
+            </w:pPr>
+            <w:r>
+              <w:rPr>
+                <w:rFonts w:ascii="Calibri" w:hAnsi="Calibri" w:eastAsia="Microsoft JhengHei"/>
+                <w:b w:val="0"/>
+                <w:color w:val="000000"/>
+                <w:sz w:val="19"/>
+              </w:rPr>
+              <w:t>Bike: 5</w:t>
+            </w:r>
+          </w:p>
+        </w:tc>
+        <w:tc>
+          <w:tcPr>
+            <w:tcW w:type="dxa" w:w="1100"/>
+            <w:tcMar>
+              <w:top w:w="80" w:type="dxa"/>
+              <w:start w:w="120" w:type="dxa"/>
+              <w:bottom w:w="80" w:type="dxa"/>
+              <w:end w:w="120" w:type="dxa"/>
+            </w:tcMar>
+            <w:vAlign w:val="center"/>
+          </w:tcPr>
+          <w:p>
+            <w:pPr>
+              <w:spacing w:after="0"/>
+              <w:jc w:val="center"/>
+            </w:pPr>
+            <w:r>
+              <w:rPr>
+                <w:rFonts w:ascii="Calibri" w:hAnsi="Calibri" w:eastAsia="Microsoft JhengHei"/>
+                <w:b w:val="0"/>
+                <w:color w:val="000000"/>
+                <w:sz w:val="19"/>
+              </w:rPr>
+              <w:t>Bike</w:t>
+            </w:r>
+          </w:p>
+        </w:tc>
+        <w:tc>
+          <w:tcPr>
+            <w:tcW w:type="dxa" w:w="1600"/>
+            <w:tcMar>
+              <w:top w:w="80" w:type="dxa"/>
+              <w:start w:w="120" w:type="dxa"/>
+              <w:bottom w:w="80" w:type="dxa"/>
+              <w:end w:w="120" w:type="dxa"/>
+            </w:tcMar>
+            <w:vAlign w:val="center"/>
+          </w:tcPr>
+          <w:p>
+            <w:pPr>
+              <w:spacing w:after="0"/>
+              <w:jc w:val="center"/>
+            </w:pPr>
+            <w:r>
+              <w:rPr>
+                <w:rFonts w:ascii="Calibri" w:hAnsi="Calibri" w:eastAsia="Microsoft JhengHei"/>
+                <w:b w:val="0"/>
+                <w:color w:val="000000"/>
+                <w:sz w:val="19"/>
+              </w:rPr>
+              <w:t>300分</w:t>
+            </w:r>
+          </w:p>
+        </w:tc>
+        <w:tc>
+          <w:tcPr>
+            <w:tcW w:type="dxa" w:w="1600"/>
+            <w:tcMar>
+              <w:top w:w="80" w:type="dxa"/>
+              <w:start w:w="120" w:type="dxa"/>
+              <w:bottom w:w="80" w:type="dxa"/>
+              <w:end w:w="120" w:type="dxa"/>
+            </w:tcMar>
+            <w:vAlign w:val="center"/>
+          </w:tcPr>
+          <w:p>
+            <w:pPr>
+              <w:spacing w:after="0"/>
+              <w:jc w:val="center"/>
+            </w:pPr>
+            <w:r>
+              <w:rPr>
+                <w:rFonts w:ascii="Calibri" w:hAnsi="Calibri" w:eastAsia="Microsoft JhengHei"/>
+                <w:b w:val="0"/>
+                <w:color w:val="000000"/>
+                <w:sz w:val="19"/>
+              </w:rPr>
+              <w:t>121分 / 52.43km</w:t>
+            </w:r>
+          </w:p>
+        </w:tc>
+        <w:tc>
+          <w:tcPr>
+            <w:tcW w:type="dxa" w:w="1160"/>
+            <w:tcMar>
+              <w:top w:w="80" w:type="dxa"/>
+              <w:start w:w="120" w:type="dxa"/>
+              <w:bottom w:w="80" w:type="dxa"/>
+              <w:end w:w="120" w:type="dxa"/>
+            </w:tcMar>
+            <w:vAlign w:val="center"/>
+          </w:tcPr>
+          <w:p>
+            <w:pPr>
+              <w:spacing w:after="0"/>
+              <w:jc w:val="center"/>
+            </w:pPr>
+            <w:r>
+              <w:rPr>
+                <w:rFonts w:ascii="Calibri" w:hAnsi="Calibri" w:eastAsia="Microsoft JhengHei"/>
+                <w:b w:val="0"/>
+                <w:color w:val="000000"/>
+                <w:sz w:val="19"/>
+              </w:rPr>
+              <w:t>✅ 已完成</w:t>
+            </w:r>
+          </w:p>
+        </w:tc>
+      </w:tr>
+      <w:tr>
+        <w:tc>
+          <w:tcPr>
+            <w:tcW w:type="dxa" w:w="1100"/>
+            <w:tcMar>
+              <w:top w:w="80" w:type="dxa"/>
+              <w:start w:w="120" w:type="dxa"/>
+              <w:bottom w:w="80" w:type="dxa"/>
+              <w:end w:w="120" w:type="dxa"/>
+            </w:tcMar>
+            <w:vAlign w:val="center"/>
+          </w:tcPr>
+          <w:p>
+            <w:pPr>
+              <w:spacing w:after="0"/>
+              <w:jc w:val="center"/>
+            </w:pPr>
+            <w:r>
+              <w:rPr>
+                <w:rFonts w:ascii="Calibri" w:hAnsi="Calibri" w:eastAsia="Microsoft JhengHei"/>
+                <w:b w:val="0"/>
+                <w:color w:val="000000"/>
+                <w:sz w:val="19"/>
+              </w:rPr>
               <w:t>08/09</w:t>
               <w:br/>
               <w:t>週日</w:t>

</xml_diff>